<commit_message>
Add Overall Use Cases and ScreenFlow; update docs
Add Documents/Overall Use Cases.svg and Documents/ScreenFlow.md, and include a recovered requirements file (Documents/~$ftware Requirement Specification - (Repaired).docx). Update design artifacts: Documents/ER Diagram.png, Documents/HV_Data_Design.docx, and modify "Documents/Quyền Gộp Thiện.mdj". These changes add missing artifacts and refresh project design and requirements documentation.
</commit_message>
<xml_diff>
--- a/Documents/HV_Data_Design.docx
+++ b/Documents/HV_Data_Design.docx
@@ -6,6 +6,7 @@
       <w:pPr>
         <w:pStyle w:val="Heading1"/>
         <w:spacing w:before="0" w:line="275" w:lineRule="auto"/>
+        <w:jc w:val="center"/>
         <w:rPr>
           <w:rFonts w:eastAsia="Google Sans" w:cs="Times New Roman"/>
         </w:rPr>
@@ -64,10 +65,10 @@
           <w:noProof/>
         </w:rPr>
         <w:drawing>
-          <wp:inline distT="0" distB="0" distL="0" distR="0" wp14:anchorId="460FBF06" wp14:editId="17E77B41">
-            <wp:extent cx="5943600" cy="6681470"/>
-            <wp:effectExtent l="0" t="0" r="0" b="5080"/>
-            <wp:docPr id="397563472" name="Picture 1"/>
+          <wp:inline distT="0" distB="0" distL="0" distR="0" wp14:anchorId="184CC5B2" wp14:editId="25BD2404">
+            <wp:extent cx="5943600" cy="5895975"/>
+            <wp:effectExtent l="0" t="0" r="0" b="9525"/>
+            <wp:docPr id="1509384083" name="Picture 1"/>
             <wp:cNvGraphicFramePr>
               <a:graphicFrameLocks xmlns:a="http://schemas.openxmlformats.org/drawingml/2006/main" noChangeAspect="1"/>
             </wp:cNvGraphicFramePr>
@@ -75,7 +76,7 @@
               <a:graphicData uri="http://schemas.openxmlformats.org/drawingml/2006/picture">
                 <pic:pic xmlns:pic="http://schemas.openxmlformats.org/drawingml/2006/picture">
                   <pic:nvPicPr>
-                    <pic:cNvPr id="397563472" name="Picture 397563472"/>
+                    <pic:cNvPr id="1509384083" name="Picture 1509384083"/>
                     <pic:cNvPicPr/>
                   </pic:nvPicPr>
                   <pic:blipFill>
@@ -93,7 +94,7 @@
                   <pic:spPr>
                     <a:xfrm>
                       <a:off x="0" y="0"/>
-                      <a:ext cx="5943600" cy="6681470"/>
+                      <a:ext cx="5943600" cy="5895975"/>
                     </a:xfrm>
                     <a:prstGeom prst="rect">
                       <a:avLst/>
@@ -840,6 +841,97 @@
                 <w:rFonts w:eastAsia="Google Sans" w:cs="Times New Roman"/>
               </w:rPr>
               <w:t>Lưu trữ chi tiết các giao dịch quyên góp tiền của nhà hảo tâm.</w:t>
+            </w:r>
+          </w:p>
+        </w:tc>
+      </w:tr>
+      <w:tr>
+        <w:tc>
+          <w:tcPr>
+            <w:tcW w:w="802" w:type="dxa"/>
+            <w:vAlign w:val="center"/>
+          </w:tcPr>
+          <w:p>
+            <w:pPr>
+              <w:pBdr>
+                <w:top w:val="nil"/>
+                <w:left w:val="nil"/>
+                <w:bottom w:val="nil"/>
+                <w:right w:val="nil"/>
+                <w:between w:val="nil"/>
+              </w:pBdr>
+              <w:spacing w:line="275" w:lineRule="auto"/>
+              <w:jc w:val="center"/>
+              <w:rPr>
+                <w:rFonts w:eastAsia="Google Sans" w:cs="Times New Roman"/>
+              </w:rPr>
+            </w:pPr>
+            <w:r>
+              <w:rPr>
+                <w:rFonts w:eastAsia="Google Sans" w:cs="Times New Roman"/>
+              </w:rPr>
+              <w:t>8</w:t>
+            </w:r>
+          </w:p>
+        </w:tc>
+        <w:tc>
+          <w:tcPr>
+            <w:tcW w:w="2253" w:type="dxa"/>
+            <w:vAlign w:val="center"/>
+          </w:tcPr>
+          <w:p>
+            <w:pPr>
+              <w:pBdr>
+                <w:top w:val="nil"/>
+                <w:left w:val="nil"/>
+                <w:bottom w:val="nil"/>
+                <w:right w:val="nil"/>
+                <w:between w:val="nil"/>
+              </w:pBdr>
+              <w:spacing w:line="275" w:lineRule="auto"/>
+              <w:jc w:val="center"/>
+              <w:rPr>
+                <w:rFonts w:eastAsia="Google Sans" w:cs="Times New Roman"/>
+              </w:rPr>
+            </w:pPr>
+            <w:r>
+              <w:rPr>
+                <w:rFonts w:eastAsia="Google Sans" w:cs="Times New Roman"/>
+              </w:rPr>
+              <w:t>user_following</w:t>
+            </w:r>
+          </w:p>
+        </w:tc>
+        <w:tc>
+          <w:tcPr>
+            <w:tcW w:w="6305" w:type="dxa"/>
+            <w:vAlign w:val="center"/>
+          </w:tcPr>
+          <w:p>
+            <w:pPr>
+              <w:pBdr>
+                <w:top w:val="nil"/>
+                <w:left w:val="nil"/>
+                <w:bottom w:val="nil"/>
+                <w:right w:val="nil"/>
+                <w:between w:val="nil"/>
+              </w:pBdr>
+              <w:spacing w:line="275" w:lineRule="auto"/>
+              <w:rPr>
+                <w:rFonts w:eastAsia="Google Sans" w:cs="Times New Roman"/>
+              </w:rPr>
+            </w:pPr>
+            <w:r>
+              <w:rPr>
+                <w:rFonts w:eastAsia="Google Sans" w:cs="Times New Roman"/>
+              </w:rPr>
+              <w:t>Lưu trữ danh sách các chiến dịch mà người dùng đang theo dõi</w:t>
+            </w:r>
+            <w:r>
+              <w:rPr>
+                <w:rFonts w:eastAsia="Google Sans" w:cs="Times New Roman"/>
+              </w:rPr>
+              <w:t>.</w:t>
             </w:r>
           </w:p>
         </w:tc>
@@ -4346,7 +4438,16 @@
                 <w:sz w:val="18"/>
                 <w:szCs w:val="18"/>
               </w:rPr>
-              <w:t>Đường dẫn lưu trữ ảnh đại diện cá nhân.</w:t>
+              <w:t xml:space="preserve">Đường dẫn lưu trữ ảnh đại </w:t>
+            </w:r>
+            <w:r>
+              <w:rPr>
+                <w:rFonts w:eastAsia="Google Sans" w:cs="Times New Roman"/>
+                <w:sz w:val="18"/>
+                <w:szCs w:val="18"/>
+              </w:rPr>
+              <w:lastRenderedPageBreak/>
+              <w:t>diện cá nhân.</w:t>
             </w:r>
           </w:p>
         </w:tc>
@@ -4378,6 +4479,7 @@
                 <w:sz w:val="18"/>
                 <w:szCs w:val="18"/>
               </w:rPr>
+              <w:lastRenderedPageBreak/>
               <w:t>8</w:t>
             </w:r>
           </w:p>
@@ -4624,16 +4726,7 @@
                 <w:sz w:val="18"/>
                 <w:szCs w:val="18"/>
               </w:rPr>
-              <w:t xml:space="preserve">Khóa ngoại liên kết bảng </w:t>
-            </w:r>
-            <w:r>
-              <w:rPr>
-                <w:rFonts w:eastAsia="Google Sans" w:cs="Times New Roman"/>
-                <w:sz w:val="18"/>
-                <w:szCs w:val="18"/>
-              </w:rPr>
-              <w:lastRenderedPageBreak/>
-              <w:t>roles.</w:t>
+              <w:t>Khóa ngoại liên kết bảng roles.</w:t>
             </w:r>
           </w:p>
         </w:tc>
@@ -4665,7 +4758,6 @@
                 <w:sz w:val="18"/>
                 <w:szCs w:val="18"/>
               </w:rPr>
-              <w:lastRenderedPageBreak/>
               <w:t>9</w:t>
             </w:r>
           </w:p>
@@ -9394,7 +9486,7 @@
                 <w:sz w:val="18"/>
                 <w:szCs w:val="18"/>
               </w:rPr>
-              <w:t>start_date</w:t>
+              <w:t>gallery_url</w:t>
             </w:r>
           </w:p>
         </w:tc>
@@ -9424,82 +9516,74 @@
                 <w:sz w:val="18"/>
                 <w:szCs w:val="18"/>
               </w:rPr>
-              <w:t>date</w:t>
-            </w:r>
-          </w:p>
-        </w:tc>
-        <w:tc>
-          <w:tcPr>
-            <w:tcW w:w="864" w:type="dxa"/>
-          </w:tcPr>
-          <w:p>
-            <w:pPr>
-              <w:pBdr>
-                <w:top w:val="nil"/>
-                <w:left w:val="nil"/>
-                <w:bottom w:val="nil"/>
-                <w:right w:val="nil"/>
-                <w:between w:val="nil"/>
-              </w:pBdr>
-              <w:spacing w:line="275" w:lineRule="auto"/>
-              <w:rPr>
-                <w:rFonts w:eastAsia="Google Sans" w:cs="Times New Roman"/>
-                <w:sz w:val="18"/>
-                <w:szCs w:val="18"/>
-              </w:rPr>
-            </w:pPr>
-          </w:p>
-        </w:tc>
-        <w:tc>
-          <w:tcPr>
-            <w:tcW w:w="864" w:type="dxa"/>
-          </w:tcPr>
-          <w:p>
-            <w:pPr>
-              <w:pBdr>
-                <w:top w:val="nil"/>
-                <w:left w:val="nil"/>
-                <w:bottom w:val="nil"/>
-                <w:right w:val="nil"/>
-                <w:between w:val="nil"/>
-              </w:pBdr>
-              <w:spacing w:line="275" w:lineRule="auto"/>
-              <w:rPr>
-                <w:rFonts w:eastAsia="Google Sans" w:cs="Times New Roman"/>
-                <w:sz w:val="18"/>
-                <w:szCs w:val="18"/>
-              </w:rPr>
-            </w:pPr>
-          </w:p>
-        </w:tc>
-        <w:tc>
-          <w:tcPr>
-            <w:tcW w:w="864" w:type="dxa"/>
-          </w:tcPr>
-          <w:p>
-            <w:pPr>
-              <w:pBdr>
-                <w:top w:val="nil"/>
-                <w:left w:val="nil"/>
-                <w:bottom w:val="nil"/>
-                <w:right w:val="nil"/>
-                <w:between w:val="nil"/>
-              </w:pBdr>
-              <w:spacing w:line="275" w:lineRule="auto"/>
-              <w:rPr>
-                <w:rFonts w:eastAsia="Google Sans" w:cs="Times New Roman"/>
-                <w:sz w:val="18"/>
-                <w:szCs w:val="18"/>
-              </w:rPr>
-            </w:pPr>
-            <w:r>
-              <w:rPr>
-                <w:rFonts w:eastAsia="Google Sans" w:cs="Times New Roman"/>
-                <w:sz w:val="18"/>
-                <w:szCs w:val="18"/>
-              </w:rPr>
-              <w:t>x</w:t>
-            </w:r>
+              <w:t>text</w:t>
+            </w:r>
+          </w:p>
+        </w:tc>
+        <w:tc>
+          <w:tcPr>
+            <w:tcW w:w="864" w:type="dxa"/>
+          </w:tcPr>
+          <w:p>
+            <w:pPr>
+              <w:pBdr>
+                <w:top w:val="nil"/>
+                <w:left w:val="nil"/>
+                <w:bottom w:val="nil"/>
+                <w:right w:val="nil"/>
+                <w:between w:val="nil"/>
+              </w:pBdr>
+              <w:spacing w:line="275" w:lineRule="auto"/>
+              <w:rPr>
+                <w:rFonts w:eastAsia="Google Sans" w:cs="Times New Roman"/>
+                <w:sz w:val="18"/>
+                <w:szCs w:val="18"/>
+              </w:rPr>
+            </w:pPr>
+          </w:p>
+        </w:tc>
+        <w:tc>
+          <w:tcPr>
+            <w:tcW w:w="864" w:type="dxa"/>
+          </w:tcPr>
+          <w:p>
+            <w:pPr>
+              <w:pBdr>
+                <w:top w:val="nil"/>
+                <w:left w:val="nil"/>
+                <w:bottom w:val="nil"/>
+                <w:right w:val="nil"/>
+                <w:between w:val="nil"/>
+              </w:pBdr>
+              <w:spacing w:line="275" w:lineRule="auto"/>
+              <w:rPr>
+                <w:rFonts w:eastAsia="Google Sans" w:cs="Times New Roman"/>
+                <w:sz w:val="18"/>
+                <w:szCs w:val="18"/>
+              </w:rPr>
+            </w:pPr>
+          </w:p>
+        </w:tc>
+        <w:tc>
+          <w:tcPr>
+            <w:tcW w:w="864" w:type="dxa"/>
+          </w:tcPr>
+          <w:p>
+            <w:pPr>
+              <w:pBdr>
+                <w:top w:val="nil"/>
+                <w:left w:val="nil"/>
+                <w:bottom w:val="nil"/>
+                <w:right w:val="nil"/>
+                <w:between w:val="nil"/>
+              </w:pBdr>
+              <w:spacing w:line="275" w:lineRule="auto"/>
+              <w:rPr>
+                <w:rFonts w:eastAsia="Google Sans" w:cs="Times New Roman"/>
+                <w:sz w:val="18"/>
+                <w:szCs w:val="18"/>
+              </w:rPr>
+            </w:pPr>
           </w:p>
         </w:tc>
         <w:tc>
@@ -9594,7 +9678,7 @@
                 <w:sz w:val="18"/>
                 <w:szCs w:val="18"/>
               </w:rPr>
-              <w:t>Ngày bắt đầu nhận tiền.</w:t>
+              <w:t>Lưu danh sách nhiều ảnh, cách nhau bằng dấu phẩy.</w:t>
             </w:r>
           </w:p>
         </w:tc>
@@ -9656,7 +9740,7 @@
                 <w:sz w:val="18"/>
                 <w:szCs w:val="18"/>
               </w:rPr>
-              <w:t>end_date</w:t>
+              <w:t>beneficiary_phone</w:t>
             </w:r>
           </w:p>
         </w:tc>
@@ -9686,82 +9770,74 @@
                 <w:sz w:val="18"/>
                 <w:szCs w:val="18"/>
               </w:rPr>
-              <w:t>date</w:t>
-            </w:r>
-          </w:p>
-        </w:tc>
-        <w:tc>
-          <w:tcPr>
-            <w:tcW w:w="864" w:type="dxa"/>
-          </w:tcPr>
-          <w:p>
-            <w:pPr>
-              <w:pBdr>
-                <w:top w:val="nil"/>
-                <w:left w:val="nil"/>
-                <w:bottom w:val="nil"/>
-                <w:right w:val="nil"/>
-                <w:between w:val="nil"/>
-              </w:pBdr>
-              <w:spacing w:line="275" w:lineRule="auto"/>
-              <w:rPr>
-                <w:rFonts w:eastAsia="Google Sans" w:cs="Times New Roman"/>
-                <w:sz w:val="18"/>
-                <w:szCs w:val="18"/>
-              </w:rPr>
-            </w:pPr>
-          </w:p>
-        </w:tc>
-        <w:tc>
-          <w:tcPr>
-            <w:tcW w:w="864" w:type="dxa"/>
-          </w:tcPr>
-          <w:p>
-            <w:pPr>
-              <w:pBdr>
-                <w:top w:val="nil"/>
-                <w:left w:val="nil"/>
-                <w:bottom w:val="nil"/>
-                <w:right w:val="nil"/>
-                <w:between w:val="nil"/>
-              </w:pBdr>
-              <w:spacing w:line="275" w:lineRule="auto"/>
-              <w:rPr>
-                <w:rFonts w:eastAsia="Google Sans" w:cs="Times New Roman"/>
-                <w:sz w:val="18"/>
-                <w:szCs w:val="18"/>
-              </w:rPr>
-            </w:pPr>
-          </w:p>
-        </w:tc>
-        <w:tc>
-          <w:tcPr>
-            <w:tcW w:w="864" w:type="dxa"/>
-          </w:tcPr>
-          <w:p>
-            <w:pPr>
-              <w:pBdr>
-                <w:top w:val="nil"/>
-                <w:left w:val="nil"/>
-                <w:bottom w:val="nil"/>
-                <w:right w:val="nil"/>
-                <w:between w:val="nil"/>
-              </w:pBdr>
-              <w:spacing w:line="275" w:lineRule="auto"/>
-              <w:rPr>
-                <w:rFonts w:eastAsia="Google Sans" w:cs="Times New Roman"/>
-                <w:sz w:val="18"/>
-                <w:szCs w:val="18"/>
-              </w:rPr>
-            </w:pPr>
-            <w:r>
-              <w:rPr>
-                <w:rFonts w:eastAsia="Google Sans" w:cs="Times New Roman"/>
-                <w:sz w:val="18"/>
-                <w:szCs w:val="18"/>
-              </w:rPr>
-              <w:t>x</w:t>
-            </w:r>
+              <w:t>varchar</w:t>
+            </w:r>
+          </w:p>
+        </w:tc>
+        <w:tc>
+          <w:tcPr>
+            <w:tcW w:w="864" w:type="dxa"/>
+          </w:tcPr>
+          <w:p>
+            <w:pPr>
+              <w:pBdr>
+                <w:top w:val="nil"/>
+                <w:left w:val="nil"/>
+                <w:bottom w:val="nil"/>
+                <w:right w:val="nil"/>
+                <w:between w:val="nil"/>
+              </w:pBdr>
+              <w:spacing w:line="275" w:lineRule="auto"/>
+              <w:rPr>
+                <w:rFonts w:eastAsia="Google Sans" w:cs="Times New Roman"/>
+                <w:sz w:val="18"/>
+                <w:szCs w:val="18"/>
+              </w:rPr>
+            </w:pPr>
+          </w:p>
+        </w:tc>
+        <w:tc>
+          <w:tcPr>
+            <w:tcW w:w="864" w:type="dxa"/>
+          </w:tcPr>
+          <w:p>
+            <w:pPr>
+              <w:pBdr>
+                <w:top w:val="nil"/>
+                <w:left w:val="nil"/>
+                <w:bottom w:val="nil"/>
+                <w:right w:val="nil"/>
+                <w:between w:val="nil"/>
+              </w:pBdr>
+              <w:spacing w:line="275" w:lineRule="auto"/>
+              <w:rPr>
+                <w:rFonts w:eastAsia="Google Sans" w:cs="Times New Roman"/>
+                <w:sz w:val="18"/>
+                <w:szCs w:val="18"/>
+              </w:rPr>
+            </w:pPr>
+          </w:p>
+        </w:tc>
+        <w:tc>
+          <w:tcPr>
+            <w:tcW w:w="864" w:type="dxa"/>
+          </w:tcPr>
+          <w:p>
+            <w:pPr>
+              <w:pBdr>
+                <w:top w:val="nil"/>
+                <w:left w:val="nil"/>
+                <w:bottom w:val="nil"/>
+                <w:right w:val="nil"/>
+                <w:between w:val="nil"/>
+              </w:pBdr>
+              <w:spacing w:line="275" w:lineRule="auto"/>
+              <w:rPr>
+                <w:rFonts w:eastAsia="Google Sans" w:cs="Times New Roman"/>
+                <w:sz w:val="18"/>
+                <w:szCs w:val="18"/>
+              </w:rPr>
+            </w:pPr>
           </w:p>
         </w:tc>
         <w:tc>
@@ -9856,7 +9932,7 @@
                 <w:sz w:val="18"/>
                 <w:szCs w:val="18"/>
               </w:rPr>
-              <w:t>Ngày kết thúc nhận tiền.</w:t>
+              <w:t>Số điền thoại của người thụ hưởng</w:t>
             </w:r>
           </w:p>
         </w:tc>
@@ -9918,7 +9994,7 @@
                 <w:sz w:val="18"/>
                 <w:szCs w:val="18"/>
               </w:rPr>
-              <w:t>target_money</w:t>
+              <w:t>start_date</w:t>
             </w:r>
           </w:p>
         </w:tc>
@@ -9948,156 +10024,148 @@
                 <w:sz w:val="18"/>
                 <w:szCs w:val="18"/>
               </w:rPr>
-              <w:t>decimal</w:t>
-            </w:r>
-          </w:p>
-        </w:tc>
-        <w:tc>
-          <w:tcPr>
-            <w:tcW w:w="864" w:type="dxa"/>
-          </w:tcPr>
-          <w:p>
-            <w:pPr>
-              <w:pBdr>
-                <w:top w:val="nil"/>
-                <w:left w:val="nil"/>
-                <w:bottom w:val="nil"/>
-                <w:right w:val="nil"/>
-                <w:between w:val="nil"/>
-              </w:pBdr>
-              <w:spacing w:line="275" w:lineRule="auto"/>
-              <w:rPr>
-                <w:rFonts w:eastAsia="Google Sans" w:cs="Times New Roman"/>
-                <w:sz w:val="18"/>
-                <w:szCs w:val="18"/>
-              </w:rPr>
-            </w:pPr>
-            <w:r>
-              <w:rPr>
-                <w:rFonts w:eastAsia="Google Sans" w:cs="Times New Roman"/>
-                <w:sz w:val="18"/>
-                <w:szCs w:val="18"/>
-              </w:rPr>
-              <w:t>15,2</w:t>
-            </w:r>
-          </w:p>
-        </w:tc>
-        <w:tc>
-          <w:tcPr>
-            <w:tcW w:w="864" w:type="dxa"/>
-          </w:tcPr>
-          <w:p>
-            <w:pPr>
-              <w:pBdr>
-                <w:top w:val="nil"/>
-                <w:left w:val="nil"/>
-                <w:bottom w:val="nil"/>
-                <w:right w:val="nil"/>
-                <w:between w:val="nil"/>
-              </w:pBdr>
-              <w:spacing w:line="275" w:lineRule="auto"/>
-              <w:rPr>
-                <w:rFonts w:eastAsia="Google Sans" w:cs="Times New Roman"/>
-                <w:sz w:val="18"/>
-                <w:szCs w:val="18"/>
-              </w:rPr>
-            </w:pPr>
-          </w:p>
-        </w:tc>
-        <w:tc>
-          <w:tcPr>
-            <w:tcW w:w="864" w:type="dxa"/>
-          </w:tcPr>
-          <w:p>
-            <w:pPr>
-              <w:pBdr>
-                <w:top w:val="nil"/>
-                <w:left w:val="nil"/>
-                <w:bottom w:val="nil"/>
-                <w:right w:val="nil"/>
-                <w:between w:val="nil"/>
-              </w:pBdr>
-              <w:spacing w:line="275" w:lineRule="auto"/>
-              <w:rPr>
-                <w:rFonts w:eastAsia="Google Sans" w:cs="Times New Roman"/>
-                <w:sz w:val="18"/>
-                <w:szCs w:val="18"/>
-              </w:rPr>
-            </w:pPr>
-          </w:p>
-        </w:tc>
-        <w:tc>
-          <w:tcPr>
-            <w:tcW w:w="864" w:type="dxa"/>
-          </w:tcPr>
-          <w:p>
-            <w:pPr>
-              <w:pBdr>
-                <w:top w:val="nil"/>
-                <w:left w:val="nil"/>
-                <w:bottom w:val="nil"/>
-                <w:right w:val="nil"/>
-                <w:between w:val="nil"/>
-              </w:pBdr>
-              <w:spacing w:line="275" w:lineRule="auto"/>
-              <w:rPr>
-                <w:rFonts w:eastAsia="Google Sans" w:cs="Times New Roman"/>
-                <w:sz w:val="18"/>
-                <w:szCs w:val="18"/>
-              </w:rPr>
-            </w:pPr>
-          </w:p>
-        </w:tc>
-        <w:tc>
-          <w:tcPr>
-            <w:tcW w:w="864" w:type="dxa"/>
-          </w:tcPr>
-          <w:p>
-            <w:pPr>
-              <w:pBdr>
-                <w:top w:val="nil"/>
-                <w:left w:val="nil"/>
-                <w:bottom w:val="nil"/>
-                <w:right w:val="nil"/>
-                <w:between w:val="nil"/>
-              </w:pBdr>
-              <w:spacing w:line="275" w:lineRule="auto"/>
-              <w:rPr>
-                <w:rFonts w:eastAsia="Google Sans" w:cs="Times New Roman"/>
-                <w:sz w:val="18"/>
-                <w:szCs w:val="18"/>
-              </w:rPr>
-            </w:pPr>
-          </w:p>
-        </w:tc>
-        <w:tc>
-          <w:tcPr>
-            <w:tcW w:w="864" w:type="dxa"/>
-          </w:tcPr>
-          <w:p>
-            <w:pPr>
-              <w:pBdr>
-                <w:top w:val="nil"/>
-                <w:left w:val="nil"/>
-                <w:bottom w:val="nil"/>
-                <w:right w:val="nil"/>
-                <w:between w:val="nil"/>
-              </w:pBdr>
-              <w:spacing w:line="275" w:lineRule="auto"/>
-              <w:rPr>
-                <w:rFonts w:eastAsia="Google Sans" w:cs="Times New Roman"/>
-                <w:sz w:val="18"/>
-                <w:szCs w:val="18"/>
-              </w:rPr>
-            </w:pPr>
-            <w:r>
-              <w:rPr>
-                <w:rFonts w:eastAsia="Google Sans" w:cs="Times New Roman"/>
-                <w:sz w:val="18"/>
-                <w:szCs w:val="18"/>
-              </w:rPr>
-              <w:t>0.00</w:t>
-            </w:r>
+              <w:t>date</w:t>
+            </w:r>
+          </w:p>
+        </w:tc>
+        <w:tc>
+          <w:tcPr>
+            <w:tcW w:w="864" w:type="dxa"/>
+          </w:tcPr>
+          <w:p>
+            <w:pPr>
+              <w:pBdr>
+                <w:top w:val="nil"/>
+                <w:left w:val="nil"/>
+                <w:bottom w:val="nil"/>
+                <w:right w:val="nil"/>
+                <w:between w:val="nil"/>
+              </w:pBdr>
+              <w:spacing w:line="275" w:lineRule="auto"/>
+              <w:rPr>
+                <w:rFonts w:eastAsia="Google Sans" w:cs="Times New Roman"/>
+                <w:sz w:val="18"/>
+                <w:szCs w:val="18"/>
+              </w:rPr>
+            </w:pPr>
+          </w:p>
+        </w:tc>
+        <w:tc>
+          <w:tcPr>
+            <w:tcW w:w="864" w:type="dxa"/>
+          </w:tcPr>
+          <w:p>
+            <w:pPr>
+              <w:pBdr>
+                <w:top w:val="nil"/>
+                <w:left w:val="nil"/>
+                <w:bottom w:val="nil"/>
+                <w:right w:val="nil"/>
+                <w:between w:val="nil"/>
+              </w:pBdr>
+              <w:spacing w:line="275" w:lineRule="auto"/>
+              <w:rPr>
+                <w:rFonts w:eastAsia="Google Sans" w:cs="Times New Roman"/>
+                <w:sz w:val="18"/>
+                <w:szCs w:val="18"/>
+              </w:rPr>
+            </w:pPr>
+          </w:p>
+        </w:tc>
+        <w:tc>
+          <w:tcPr>
+            <w:tcW w:w="864" w:type="dxa"/>
+          </w:tcPr>
+          <w:p>
+            <w:pPr>
+              <w:pBdr>
+                <w:top w:val="nil"/>
+                <w:left w:val="nil"/>
+                <w:bottom w:val="nil"/>
+                <w:right w:val="nil"/>
+                <w:between w:val="nil"/>
+              </w:pBdr>
+              <w:spacing w:line="275" w:lineRule="auto"/>
+              <w:rPr>
+                <w:rFonts w:eastAsia="Google Sans" w:cs="Times New Roman"/>
+                <w:sz w:val="18"/>
+                <w:szCs w:val="18"/>
+              </w:rPr>
+            </w:pPr>
+            <w:r>
+              <w:rPr>
+                <w:rFonts w:eastAsia="Google Sans" w:cs="Times New Roman"/>
+                <w:sz w:val="18"/>
+                <w:szCs w:val="18"/>
+              </w:rPr>
+              <w:t>x</w:t>
+            </w:r>
+          </w:p>
+        </w:tc>
+        <w:tc>
+          <w:tcPr>
+            <w:tcW w:w="864" w:type="dxa"/>
+          </w:tcPr>
+          <w:p>
+            <w:pPr>
+              <w:pBdr>
+                <w:top w:val="nil"/>
+                <w:left w:val="nil"/>
+                <w:bottom w:val="nil"/>
+                <w:right w:val="nil"/>
+                <w:between w:val="nil"/>
+              </w:pBdr>
+              <w:spacing w:line="275" w:lineRule="auto"/>
+              <w:rPr>
+                <w:rFonts w:eastAsia="Google Sans" w:cs="Times New Roman"/>
+                <w:sz w:val="18"/>
+                <w:szCs w:val="18"/>
+              </w:rPr>
+            </w:pPr>
+          </w:p>
+        </w:tc>
+        <w:tc>
+          <w:tcPr>
+            <w:tcW w:w="864" w:type="dxa"/>
+          </w:tcPr>
+          <w:p>
+            <w:pPr>
+              <w:pBdr>
+                <w:top w:val="nil"/>
+                <w:left w:val="nil"/>
+                <w:bottom w:val="nil"/>
+                <w:right w:val="nil"/>
+                <w:between w:val="nil"/>
+              </w:pBdr>
+              <w:spacing w:line="275" w:lineRule="auto"/>
+              <w:rPr>
+                <w:rFonts w:eastAsia="Google Sans" w:cs="Times New Roman"/>
+                <w:sz w:val="18"/>
+                <w:szCs w:val="18"/>
+              </w:rPr>
+            </w:pPr>
+          </w:p>
+        </w:tc>
+        <w:tc>
+          <w:tcPr>
+            <w:tcW w:w="864" w:type="dxa"/>
+          </w:tcPr>
+          <w:p>
+            <w:pPr>
+              <w:pBdr>
+                <w:top w:val="nil"/>
+                <w:left w:val="nil"/>
+                <w:bottom w:val="nil"/>
+                <w:right w:val="nil"/>
+                <w:between w:val="nil"/>
+              </w:pBdr>
+              <w:spacing w:line="275" w:lineRule="auto"/>
+              <w:rPr>
+                <w:rFonts w:eastAsia="Google Sans" w:cs="Times New Roman"/>
+                <w:sz w:val="18"/>
+                <w:szCs w:val="18"/>
+              </w:rPr>
+            </w:pPr>
           </w:p>
         </w:tc>
         <w:tc>
@@ -10126,7 +10194,7 @@
                 <w:sz w:val="18"/>
                 <w:szCs w:val="18"/>
               </w:rPr>
-              <w:t>Số tiền mục tiêu đề ra.</w:t>
+              <w:t>Ngày bắt đầu nhận tiền.</w:t>
             </w:r>
           </w:p>
         </w:tc>
@@ -10188,7 +10256,7 @@
                 <w:sz w:val="18"/>
                 <w:szCs w:val="18"/>
               </w:rPr>
-              <w:t>current_money</w:t>
+              <w:t>end_date</w:t>
             </w:r>
           </w:p>
         </w:tc>
@@ -10218,156 +10286,148 @@
                 <w:sz w:val="18"/>
                 <w:szCs w:val="18"/>
               </w:rPr>
-              <w:t>decimal</w:t>
-            </w:r>
-          </w:p>
-        </w:tc>
-        <w:tc>
-          <w:tcPr>
-            <w:tcW w:w="864" w:type="dxa"/>
-          </w:tcPr>
-          <w:p>
-            <w:pPr>
-              <w:pBdr>
-                <w:top w:val="nil"/>
-                <w:left w:val="nil"/>
-                <w:bottom w:val="nil"/>
-                <w:right w:val="nil"/>
-                <w:between w:val="nil"/>
-              </w:pBdr>
-              <w:spacing w:line="275" w:lineRule="auto"/>
-              <w:rPr>
-                <w:rFonts w:eastAsia="Google Sans" w:cs="Times New Roman"/>
-                <w:sz w:val="18"/>
-                <w:szCs w:val="18"/>
-              </w:rPr>
-            </w:pPr>
-            <w:r>
-              <w:rPr>
-                <w:rFonts w:eastAsia="Google Sans" w:cs="Times New Roman"/>
-                <w:sz w:val="18"/>
-                <w:szCs w:val="18"/>
-              </w:rPr>
-              <w:t>15,2</w:t>
-            </w:r>
-          </w:p>
-        </w:tc>
-        <w:tc>
-          <w:tcPr>
-            <w:tcW w:w="864" w:type="dxa"/>
-          </w:tcPr>
-          <w:p>
-            <w:pPr>
-              <w:pBdr>
-                <w:top w:val="nil"/>
-                <w:left w:val="nil"/>
-                <w:bottom w:val="nil"/>
-                <w:right w:val="nil"/>
-                <w:between w:val="nil"/>
-              </w:pBdr>
-              <w:spacing w:line="275" w:lineRule="auto"/>
-              <w:rPr>
-                <w:rFonts w:eastAsia="Google Sans" w:cs="Times New Roman"/>
-                <w:sz w:val="18"/>
-                <w:szCs w:val="18"/>
-              </w:rPr>
-            </w:pPr>
-          </w:p>
-        </w:tc>
-        <w:tc>
-          <w:tcPr>
-            <w:tcW w:w="864" w:type="dxa"/>
-          </w:tcPr>
-          <w:p>
-            <w:pPr>
-              <w:pBdr>
-                <w:top w:val="nil"/>
-                <w:left w:val="nil"/>
-                <w:bottom w:val="nil"/>
-                <w:right w:val="nil"/>
-                <w:between w:val="nil"/>
-              </w:pBdr>
-              <w:spacing w:line="275" w:lineRule="auto"/>
-              <w:rPr>
-                <w:rFonts w:eastAsia="Google Sans" w:cs="Times New Roman"/>
-                <w:sz w:val="18"/>
-                <w:szCs w:val="18"/>
-              </w:rPr>
-            </w:pPr>
-          </w:p>
-        </w:tc>
-        <w:tc>
-          <w:tcPr>
-            <w:tcW w:w="864" w:type="dxa"/>
-          </w:tcPr>
-          <w:p>
-            <w:pPr>
-              <w:pBdr>
-                <w:top w:val="nil"/>
-                <w:left w:val="nil"/>
-                <w:bottom w:val="nil"/>
-                <w:right w:val="nil"/>
-                <w:between w:val="nil"/>
-              </w:pBdr>
-              <w:spacing w:line="275" w:lineRule="auto"/>
-              <w:rPr>
-                <w:rFonts w:eastAsia="Google Sans" w:cs="Times New Roman"/>
-                <w:sz w:val="18"/>
-                <w:szCs w:val="18"/>
-              </w:rPr>
-            </w:pPr>
-          </w:p>
-        </w:tc>
-        <w:tc>
-          <w:tcPr>
-            <w:tcW w:w="864" w:type="dxa"/>
-          </w:tcPr>
-          <w:p>
-            <w:pPr>
-              <w:pBdr>
-                <w:top w:val="nil"/>
-                <w:left w:val="nil"/>
-                <w:bottom w:val="nil"/>
-                <w:right w:val="nil"/>
-                <w:between w:val="nil"/>
-              </w:pBdr>
-              <w:spacing w:line="275" w:lineRule="auto"/>
-              <w:rPr>
-                <w:rFonts w:eastAsia="Google Sans" w:cs="Times New Roman"/>
-                <w:sz w:val="18"/>
-                <w:szCs w:val="18"/>
-              </w:rPr>
-            </w:pPr>
-          </w:p>
-        </w:tc>
-        <w:tc>
-          <w:tcPr>
-            <w:tcW w:w="864" w:type="dxa"/>
-          </w:tcPr>
-          <w:p>
-            <w:pPr>
-              <w:pBdr>
-                <w:top w:val="nil"/>
-                <w:left w:val="nil"/>
-                <w:bottom w:val="nil"/>
-                <w:right w:val="nil"/>
-                <w:between w:val="nil"/>
-              </w:pBdr>
-              <w:spacing w:line="275" w:lineRule="auto"/>
-              <w:rPr>
-                <w:rFonts w:eastAsia="Google Sans" w:cs="Times New Roman"/>
-                <w:sz w:val="18"/>
-                <w:szCs w:val="18"/>
-              </w:rPr>
-            </w:pPr>
-            <w:r>
-              <w:rPr>
-                <w:rFonts w:eastAsia="Google Sans" w:cs="Times New Roman"/>
-                <w:sz w:val="18"/>
-                <w:szCs w:val="18"/>
-              </w:rPr>
-              <w:t>0.00</w:t>
-            </w:r>
+              <w:t>date</w:t>
+            </w:r>
+          </w:p>
+        </w:tc>
+        <w:tc>
+          <w:tcPr>
+            <w:tcW w:w="864" w:type="dxa"/>
+          </w:tcPr>
+          <w:p>
+            <w:pPr>
+              <w:pBdr>
+                <w:top w:val="nil"/>
+                <w:left w:val="nil"/>
+                <w:bottom w:val="nil"/>
+                <w:right w:val="nil"/>
+                <w:between w:val="nil"/>
+              </w:pBdr>
+              <w:spacing w:line="275" w:lineRule="auto"/>
+              <w:rPr>
+                <w:rFonts w:eastAsia="Google Sans" w:cs="Times New Roman"/>
+                <w:sz w:val="18"/>
+                <w:szCs w:val="18"/>
+              </w:rPr>
+            </w:pPr>
+          </w:p>
+        </w:tc>
+        <w:tc>
+          <w:tcPr>
+            <w:tcW w:w="864" w:type="dxa"/>
+          </w:tcPr>
+          <w:p>
+            <w:pPr>
+              <w:pBdr>
+                <w:top w:val="nil"/>
+                <w:left w:val="nil"/>
+                <w:bottom w:val="nil"/>
+                <w:right w:val="nil"/>
+                <w:between w:val="nil"/>
+              </w:pBdr>
+              <w:spacing w:line="275" w:lineRule="auto"/>
+              <w:rPr>
+                <w:rFonts w:eastAsia="Google Sans" w:cs="Times New Roman"/>
+                <w:sz w:val="18"/>
+                <w:szCs w:val="18"/>
+              </w:rPr>
+            </w:pPr>
+          </w:p>
+        </w:tc>
+        <w:tc>
+          <w:tcPr>
+            <w:tcW w:w="864" w:type="dxa"/>
+          </w:tcPr>
+          <w:p>
+            <w:pPr>
+              <w:pBdr>
+                <w:top w:val="nil"/>
+                <w:left w:val="nil"/>
+                <w:bottom w:val="nil"/>
+                <w:right w:val="nil"/>
+                <w:between w:val="nil"/>
+              </w:pBdr>
+              <w:spacing w:line="275" w:lineRule="auto"/>
+              <w:rPr>
+                <w:rFonts w:eastAsia="Google Sans" w:cs="Times New Roman"/>
+                <w:sz w:val="18"/>
+                <w:szCs w:val="18"/>
+              </w:rPr>
+            </w:pPr>
+            <w:r>
+              <w:rPr>
+                <w:rFonts w:eastAsia="Google Sans" w:cs="Times New Roman"/>
+                <w:sz w:val="18"/>
+                <w:szCs w:val="18"/>
+              </w:rPr>
+              <w:t>x</w:t>
+            </w:r>
+          </w:p>
+        </w:tc>
+        <w:tc>
+          <w:tcPr>
+            <w:tcW w:w="864" w:type="dxa"/>
+          </w:tcPr>
+          <w:p>
+            <w:pPr>
+              <w:pBdr>
+                <w:top w:val="nil"/>
+                <w:left w:val="nil"/>
+                <w:bottom w:val="nil"/>
+                <w:right w:val="nil"/>
+                <w:between w:val="nil"/>
+              </w:pBdr>
+              <w:spacing w:line="275" w:lineRule="auto"/>
+              <w:rPr>
+                <w:rFonts w:eastAsia="Google Sans" w:cs="Times New Roman"/>
+                <w:sz w:val="18"/>
+                <w:szCs w:val="18"/>
+              </w:rPr>
+            </w:pPr>
+          </w:p>
+        </w:tc>
+        <w:tc>
+          <w:tcPr>
+            <w:tcW w:w="864" w:type="dxa"/>
+          </w:tcPr>
+          <w:p>
+            <w:pPr>
+              <w:pBdr>
+                <w:top w:val="nil"/>
+                <w:left w:val="nil"/>
+                <w:bottom w:val="nil"/>
+                <w:right w:val="nil"/>
+                <w:between w:val="nil"/>
+              </w:pBdr>
+              <w:spacing w:line="275" w:lineRule="auto"/>
+              <w:rPr>
+                <w:rFonts w:eastAsia="Google Sans" w:cs="Times New Roman"/>
+                <w:sz w:val="18"/>
+                <w:szCs w:val="18"/>
+              </w:rPr>
+            </w:pPr>
+          </w:p>
+        </w:tc>
+        <w:tc>
+          <w:tcPr>
+            <w:tcW w:w="864" w:type="dxa"/>
+          </w:tcPr>
+          <w:p>
+            <w:pPr>
+              <w:pBdr>
+                <w:top w:val="nil"/>
+                <w:left w:val="nil"/>
+                <w:bottom w:val="nil"/>
+                <w:right w:val="nil"/>
+                <w:between w:val="nil"/>
+              </w:pBdr>
+              <w:spacing w:line="275" w:lineRule="auto"/>
+              <w:rPr>
+                <w:rFonts w:eastAsia="Google Sans" w:cs="Times New Roman"/>
+                <w:sz w:val="18"/>
+                <w:szCs w:val="18"/>
+              </w:rPr>
+            </w:pPr>
           </w:p>
         </w:tc>
         <w:tc>
@@ -10396,7 +10456,7 @@
                 <w:sz w:val="18"/>
                 <w:szCs w:val="18"/>
               </w:rPr>
-              <w:t>Số tiền thực tế đã nhận được (Cộng dồn).</w:t>
+              <w:t>Ngày kết thúc nhận tiền.</w:t>
             </w:r>
           </w:p>
         </w:tc>
@@ -10428,7 +10488,16 @@
                 <w:sz w:val="18"/>
                 <w:szCs w:val="18"/>
               </w:rPr>
-              <w:t>12</w:t>
+              <w:lastRenderedPageBreak/>
+              <w:t>1</w:t>
+            </w:r>
+            <w:r>
+              <w:rPr>
+                <w:rFonts w:eastAsia="Google Sans" w:cs="Times New Roman"/>
+                <w:sz w:val="18"/>
+                <w:szCs w:val="18"/>
+              </w:rPr>
+              <w:t>2</w:t>
             </w:r>
           </w:p>
         </w:tc>
@@ -10458,7 +10527,7 @@
                 <w:sz w:val="18"/>
                 <w:szCs w:val="18"/>
               </w:rPr>
-              <w:t>status</w:t>
+              <w:t>target_money</w:t>
             </w:r>
           </w:p>
         </w:tc>
@@ -10488,155 +10557,155 @@
                 <w:sz w:val="18"/>
                 <w:szCs w:val="18"/>
               </w:rPr>
-              <w:t>tinyint</w:t>
-            </w:r>
-          </w:p>
-        </w:tc>
-        <w:tc>
-          <w:tcPr>
-            <w:tcW w:w="864" w:type="dxa"/>
-          </w:tcPr>
-          <w:p>
-            <w:pPr>
-              <w:pBdr>
-                <w:top w:val="nil"/>
-                <w:left w:val="nil"/>
-                <w:bottom w:val="nil"/>
-                <w:right w:val="nil"/>
-                <w:between w:val="nil"/>
-              </w:pBdr>
-              <w:spacing w:line="275" w:lineRule="auto"/>
-              <w:rPr>
-                <w:rFonts w:eastAsia="Google Sans" w:cs="Times New Roman"/>
-                <w:sz w:val="18"/>
-                <w:szCs w:val="18"/>
-              </w:rPr>
-            </w:pPr>
-            <w:r>
-              <w:rPr>
-                <w:rFonts w:eastAsia="Google Sans" w:cs="Times New Roman"/>
-                <w:sz w:val="18"/>
-                <w:szCs w:val="18"/>
-              </w:rPr>
-              <w:t>1</w:t>
-            </w:r>
-          </w:p>
-        </w:tc>
-        <w:tc>
-          <w:tcPr>
-            <w:tcW w:w="864" w:type="dxa"/>
-          </w:tcPr>
-          <w:p>
-            <w:pPr>
-              <w:pBdr>
-                <w:top w:val="nil"/>
-                <w:left w:val="nil"/>
-                <w:bottom w:val="nil"/>
-                <w:right w:val="nil"/>
-                <w:between w:val="nil"/>
-              </w:pBdr>
-              <w:spacing w:line="275" w:lineRule="auto"/>
-              <w:rPr>
-                <w:rFonts w:eastAsia="Google Sans" w:cs="Times New Roman"/>
-                <w:sz w:val="18"/>
-                <w:szCs w:val="18"/>
-              </w:rPr>
-            </w:pPr>
-          </w:p>
-        </w:tc>
-        <w:tc>
-          <w:tcPr>
-            <w:tcW w:w="864" w:type="dxa"/>
-          </w:tcPr>
-          <w:p>
-            <w:pPr>
-              <w:pBdr>
-                <w:top w:val="nil"/>
-                <w:left w:val="nil"/>
-                <w:bottom w:val="nil"/>
-                <w:right w:val="nil"/>
-                <w:between w:val="nil"/>
-              </w:pBdr>
-              <w:spacing w:line="275" w:lineRule="auto"/>
-              <w:rPr>
-                <w:rFonts w:eastAsia="Google Sans" w:cs="Times New Roman"/>
-                <w:sz w:val="18"/>
-                <w:szCs w:val="18"/>
-              </w:rPr>
-            </w:pPr>
-          </w:p>
-        </w:tc>
-        <w:tc>
-          <w:tcPr>
-            <w:tcW w:w="864" w:type="dxa"/>
-          </w:tcPr>
-          <w:p>
-            <w:pPr>
-              <w:pBdr>
-                <w:top w:val="nil"/>
-                <w:left w:val="nil"/>
-                <w:bottom w:val="nil"/>
-                <w:right w:val="nil"/>
-                <w:between w:val="nil"/>
-              </w:pBdr>
-              <w:spacing w:line="275" w:lineRule="auto"/>
-              <w:rPr>
-                <w:rFonts w:eastAsia="Google Sans" w:cs="Times New Roman"/>
-                <w:sz w:val="18"/>
-                <w:szCs w:val="18"/>
-              </w:rPr>
-            </w:pPr>
-          </w:p>
-        </w:tc>
-        <w:tc>
-          <w:tcPr>
-            <w:tcW w:w="864" w:type="dxa"/>
-          </w:tcPr>
-          <w:p>
-            <w:pPr>
-              <w:pBdr>
-                <w:top w:val="nil"/>
-                <w:left w:val="nil"/>
-                <w:bottom w:val="nil"/>
-                <w:right w:val="nil"/>
-                <w:between w:val="nil"/>
-              </w:pBdr>
-              <w:spacing w:line="275" w:lineRule="auto"/>
-              <w:rPr>
-                <w:rFonts w:eastAsia="Google Sans" w:cs="Times New Roman"/>
-                <w:sz w:val="18"/>
-                <w:szCs w:val="18"/>
-              </w:rPr>
-            </w:pPr>
-          </w:p>
-        </w:tc>
-        <w:tc>
-          <w:tcPr>
-            <w:tcW w:w="864" w:type="dxa"/>
-          </w:tcPr>
-          <w:p>
-            <w:pPr>
-              <w:pBdr>
-                <w:top w:val="nil"/>
-                <w:left w:val="nil"/>
-                <w:bottom w:val="nil"/>
-                <w:right w:val="nil"/>
-                <w:between w:val="nil"/>
-              </w:pBdr>
-              <w:spacing w:line="275" w:lineRule="auto"/>
-              <w:rPr>
-                <w:rFonts w:eastAsia="Google Sans" w:cs="Times New Roman"/>
-                <w:sz w:val="18"/>
-                <w:szCs w:val="18"/>
-              </w:rPr>
-            </w:pPr>
-            <w:r>
-              <w:rPr>
-                <w:rFonts w:eastAsia="Google Sans" w:cs="Times New Roman"/>
-                <w:sz w:val="18"/>
-                <w:szCs w:val="18"/>
-              </w:rPr>
-              <w:t>0</w:t>
+              <w:t>decimal</w:t>
+            </w:r>
+          </w:p>
+        </w:tc>
+        <w:tc>
+          <w:tcPr>
+            <w:tcW w:w="864" w:type="dxa"/>
+          </w:tcPr>
+          <w:p>
+            <w:pPr>
+              <w:pBdr>
+                <w:top w:val="nil"/>
+                <w:left w:val="nil"/>
+                <w:bottom w:val="nil"/>
+                <w:right w:val="nil"/>
+                <w:between w:val="nil"/>
+              </w:pBdr>
+              <w:spacing w:line="275" w:lineRule="auto"/>
+              <w:rPr>
+                <w:rFonts w:eastAsia="Google Sans" w:cs="Times New Roman"/>
+                <w:sz w:val="18"/>
+                <w:szCs w:val="18"/>
+              </w:rPr>
+            </w:pPr>
+            <w:r>
+              <w:rPr>
+                <w:rFonts w:eastAsia="Google Sans" w:cs="Times New Roman"/>
+                <w:sz w:val="18"/>
+                <w:szCs w:val="18"/>
+              </w:rPr>
+              <w:t>15,2</w:t>
+            </w:r>
+          </w:p>
+        </w:tc>
+        <w:tc>
+          <w:tcPr>
+            <w:tcW w:w="864" w:type="dxa"/>
+          </w:tcPr>
+          <w:p>
+            <w:pPr>
+              <w:pBdr>
+                <w:top w:val="nil"/>
+                <w:left w:val="nil"/>
+                <w:bottom w:val="nil"/>
+                <w:right w:val="nil"/>
+                <w:between w:val="nil"/>
+              </w:pBdr>
+              <w:spacing w:line="275" w:lineRule="auto"/>
+              <w:rPr>
+                <w:rFonts w:eastAsia="Google Sans" w:cs="Times New Roman"/>
+                <w:sz w:val="18"/>
+                <w:szCs w:val="18"/>
+              </w:rPr>
+            </w:pPr>
+          </w:p>
+        </w:tc>
+        <w:tc>
+          <w:tcPr>
+            <w:tcW w:w="864" w:type="dxa"/>
+          </w:tcPr>
+          <w:p>
+            <w:pPr>
+              <w:pBdr>
+                <w:top w:val="nil"/>
+                <w:left w:val="nil"/>
+                <w:bottom w:val="nil"/>
+                <w:right w:val="nil"/>
+                <w:between w:val="nil"/>
+              </w:pBdr>
+              <w:spacing w:line="275" w:lineRule="auto"/>
+              <w:rPr>
+                <w:rFonts w:eastAsia="Google Sans" w:cs="Times New Roman"/>
+                <w:sz w:val="18"/>
+                <w:szCs w:val="18"/>
+              </w:rPr>
+            </w:pPr>
+          </w:p>
+        </w:tc>
+        <w:tc>
+          <w:tcPr>
+            <w:tcW w:w="864" w:type="dxa"/>
+          </w:tcPr>
+          <w:p>
+            <w:pPr>
+              <w:pBdr>
+                <w:top w:val="nil"/>
+                <w:left w:val="nil"/>
+                <w:bottom w:val="nil"/>
+                <w:right w:val="nil"/>
+                <w:between w:val="nil"/>
+              </w:pBdr>
+              <w:spacing w:line="275" w:lineRule="auto"/>
+              <w:rPr>
+                <w:rFonts w:eastAsia="Google Sans" w:cs="Times New Roman"/>
+                <w:sz w:val="18"/>
+                <w:szCs w:val="18"/>
+              </w:rPr>
+            </w:pPr>
+          </w:p>
+        </w:tc>
+        <w:tc>
+          <w:tcPr>
+            <w:tcW w:w="864" w:type="dxa"/>
+          </w:tcPr>
+          <w:p>
+            <w:pPr>
+              <w:pBdr>
+                <w:top w:val="nil"/>
+                <w:left w:val="nil"/>
+                <w:bottom w:val="nil"/>
+                <w:right w:val="nil"/>
+                <w:between w:val="nil"/>
+              </w:pBdr>
+              <w:spacing w:line="275" w:lineRule="auto"/>
+              <w:rPr>
+                <w:rFonts w:eastAsia="Google Sans" w:cs="Times New Roman"/>
+                <w:sz w:val="18"/>
+                <w:szCs w:val="18"/>
+              </w:rPr>
+            </w:pPr>
+          </w:p>
+        </w:tc>
+        <w:tc>
+          <w:tcPr>
+            <w:tcW w:w="864" w:type="dxa"/>
+          </w:tcPr>
+          <w:p>
+            <w:pPr>
+              <w:pBdr>
+                <w:top w:val="nil"/>
+                <w:left w:val="nil"/>
+                <w:bottom w:val="nil"/>
+                <w:right w:val="nil"/>
+                <w:between w:val="nil"/>
+              </w:pBdr>
+              <w:spacing w:line="275" w:lineRule="auto"/>
+              <w:rPr>
+                <w:rFonts w:eastAsia="Google Sans" w:cs="Times New Roman"/>
+                <w:sz w:val="18"/>
+                <w:szCs w:val="18"/>
+              </w:rPr>
+            </w:pPr>
+            <w:r>
+              <w:rPr>
+                <w:rFonts w:eastAsia="Google Sans" w:cs="Times New Roman"/>
+                <w:sz w:val="18"/>
+                <w:szCs w:val="18"/>
+              </w:rPr>
+              <w:t>0.00</w:t>
             </w:r>
           </w:p>
         </w:tc>
@@ -10666,7 +10735,7 @@
                 <w:sz w:val="18"/>
                 <w:szCs w:val="18"/>
               </w:rPr>
-              <w:t>0=Mới, 1=Đang chạy, 2=Đã kết thúc, 3=Đóng.</w:t>
+              <w:t>Số tiền mục tiêu đề ra.</w:t>
             </w:r>
           </w:p>
         </w:tc>
@@ -10698,8 +10767,571 @@
                 <w:sz w:val="18"/>
                 <w:szCs w:val="18"/>
               </w:rPr>
-              <w:lastRenderedPageBreak/>
-              <w:t>13</w:t>
+              <w:t>1</w:t>
+            </w:r>
+            <w:r>
+              <w:rPr>
+                <w:rFonts w:eastAsia="Google Sans" w:cs="Times New Roman"/>
+                <w:sz w:val="18"/>
+                <w:szCs w:val="18"/>
+              </w:rPr>
+              <w:t>3</w:t>
+            </w:r>
+          </w:p>
+        </w:tc>
+        <w:tc>
+          <w:tcPr>
+            <w:tcW w:w="1008" w:type="dxa"/>
+          </w:tcPr>
+          <w:p>
+            <w:pPr>
+              <w:pBdr>
+                <w:top w:val="nil"/>
+                <w:left w:val="nil"/>
+                <w:bottom w:val="nil"/>
+                <w:right w:val="nil"/>
+                <w:between w:val="nil"/>
+              </w:pBdr>
+              <w:spacing w:line="275" w:lineRule="auto"/>
+              <w:rPr>
+                <w:rFonts w:eastAsia="Google Sans" w:cs="Times New Roman"/>
+                <w:sz w:val="18"/>
+                <w:szCs w:val="18"/>
+              </w:rPr>
+            </w:pPr>
+            <w:r>
+              <w:rPr>
+                <w:rFonts w:eastAsia="Google Sans" w:cs="Times New Roman"/>
+                <w:sz w:val="18"/>
+                <w:szCs w:val="18"/>
+              </w:rPr>
+              <w:t>current_money</w:t>
+            </w:r>
+          </w:p>
+        </w:tc>
+        <w:tc>
+          <w:tcPr>
+            <w:tcW w:w="1008" w:type="dxa"/>
+          </w:tcPr>
+          <w:p>
+            <w:pPr>
+              <w:pBdr>
+                <w:top w:val="nil"/>
+                <w:left w:val="nil"/>
+                <w:bottom w:val="nil"/>
+                <w:right w:val="nil"/>
+                <w:between w:val="nil"/>
+              </w:pBdr>
+              <w:spacing w:line="275" w:lineRule="auto"/>
+              <w:rPr>
+                <w:rFonts w:eastAsia="Google Sans" w:cs="Times New Roman"/>
+                <w:sz w:val="18"/>
+                <w:szCs w:val="18"/>
+              </w:rPr>
+            </w:pPr>
+            <w:r>
+              <w:rPr>
+                <w:rFonts w:eastAsia="Google Sans" w:cs="Times New Roman"/>
+                <w:sz w:val="18"/>
+                <w:szCs w:val="18"/>
+              </w:rPr>
+              <w:t>decimal</w:t>
+            </w:r>
+          </w:p>
+        </w:tc>
+        <w:tc>
+          <w:tcPr>
+            <w:tcW w:w="864" w:type="dxa"/>
+          </w:tcPr>
+          <w:p>
+            <w:pPr>
+              <w:pBdr>
+                <w:top w:val="nil"/>
+                <w:left w:val="nil"/>
+                <w:bottom w:val="nil"/>
+                <w:right w:val="nil"/>
+                <w:between w:val="nil"/>
+              </w:pBdr>
+              <w:spacing w:line="275" w:lineRule="auto"/>
+              <w:rPr>
+                <w:rFonts w:eastAsia="Google Sans" w:cs="Times New Roman"/>
+                <w:sz w:val="18"/>
+                <w:szCs w:val="18"/>
+              </w:rPr>
+            </w:pPr>
+            <w:r>
+              <w:rPr>
+                <w:rFonts w:eastAsia="Google Sans" w:cs="Times New Roman"/>
+                <w:sz w:val="18"/>
+                <w:szCs w:val="18"/>
+              </w:rPr>
+              <w:t>15,2</w:t>
+            </w:r>
+          </w:p>
+        </w:tc>
+        <w:tc>
+          <w:tcPr>
+            <w:tcW w:w="864" w:type="dxa"/>
+          </w:tcPr>
+          <w:p>
+            <w:pPr>
+              <w:pBdr>
+                <w:top w:val="nil"/>
+                <w:left w:val="nil"/>
+                <w:bottom w:val="nil"/>
+                <w:right w:val="nil"/>
+                <w:between w:val="nil"/>
+              </w:pBdr>
+              <w:spacing w:line="275" w:lineRule="auto"/>
+              <w:rPr>
+                <w:rFonts w:eastAsia="Google Sans" w:cs="Times New Roman"/>
+                <w:sz w:val="18"/>
+                <w:szCs w:val="18"/>
+              </w:rPr>
+            </w:pPr>
+          </w:p>
+        </w:tc>
+        <w:tc>
+          <w:tcPr>
+            <w:tcW w:w="864" w:type="dxa"/>
+          </w:tcPr>
+          <w:p>
+            <w:pPr>
+              <w:pBdr>
+                <w:top w:val="nil"/>
+                <w:left w:val="nil"/>
+                <w:bottom w:val="nil"/>
+                <w:right w:val="nil"/>
+                <w:between w:val="nil"/>
+              </w:pBdr>
+              <w:spacing w:line="275" w:lineRule="auto"/>
+              <w:rPr>
+                <w:rFonts w:eastAsia="Google Sans" w:cs="Times New Roman"/>
+                <w:sz w:val="18"/>
+                <w:szCs w:val="18"/>
+              </w:rPr>
+            </w:pPr>
+          </w:p>
+        </w:tc>
+        <w:tc>
+          <w:tcPr>
+            <w:tcW w:w="864" w:type="dxa"/>
+          </w:tcPr>
+          <w:p>
+            <w:pPr>
+              <w:pBdr>
+                <w:top w:val="nil"/>
+                <w:left w:val="nil"/>
+                <w:bottom w:val="nil"/>
+                <w:right w:val="nil"/>
+                <w:between w:val="nil"/>
+              </w:pBdr>
+              <w:spacing w:line="275" w:lineRule="auto"/>
+              <w:rPr>
+                <w:rFonts w:eastAsia="Google Sans" w:cs="Times New Roman"/>
+                <w:sz w:val="18"/>
+                <w:szCs w:val="18"/>
+              </w:rPr>
+            </w:pPr>
+          </w:p>
+        </w:tc>
+        <w:tc>
+          <w:tcPr>
+            <w:tcW w:w="864" w:type="dxa"/>
+          </w:tcPr>
+          <w:p>
+            <w:pPr>
+              <w:pBdr>
+                <w:top w:val="nil"/>
+                <w:left w:val="nil"/>
+                <w:bottom w:val="nil"/>
+                <w:right w:val="nil"/>
+                <w:between w:val="nil"/>
+              </w:pBdr>
+              <w:spacing w:line="275" w:lineRule="auto"/>
+              <w:rPr>
+                <w:rFonts w:eastAsia="Google Sans" w:cs="Times New Roman"/>
+                <w:sz w:val="18"/>
+                <w:szCs w:val="18"/>
+              </w:rPr>
+            </w:pPr>
+          </w:p>
+        </w:tc>
+        <w:tc>
+          <w:tcPr>
+            <w:tcW w:w="864" w:type="dxa"/>
+          </w:tcPr>
+          <w:p>
+            <w:pPr>
+              <w:pBdr>
+                <w:top w:val="nil"/>
+                <w:left w:val="nil"/>
+                <w:bottom w:val="nil"/>
+                <w:right w:val="nil"/>
+                <w:between w:val="nil"/>
+              </w:pBdr>
+              <w:spacing w:line="275" w:lineRule="auto"/>
+              <w:rPr>
+                <w:rFonts w:eastAsia="Google Sans" w:cs="Times New Roman"/>
+                <w:sz w:val="18"/>
+                <w:szCs w:val="18"/>
+              </w:rPr>
+            </w:pPr>
+            <w:r>
+              <w:rPr>
+                <w:rFonts w:eastAsia="Google Sans" w:cs="Times New Roman"/>
+                <w:sz w:val="18"/>
+                <w:szCs w:val="18"/>
+              </w:rPr>
+              <w:t>0.00</w:t>
+            </w:r>
+          </w:p>
+        </w:tc>
+        <w:tc>
+          <w:tcPr>
+            <w:tcW w:w="2304" w:type="dxa"/>
+          </w:tcPr>
+          <w:p>
+            <w:pPr>
+              <w:pBdr>
+                <w:top w:val="nil"/>
+                <w:left w:val="nil"/>
+                <w:bottom w:val="nil"/>
+                <w:right w:val="nil"/>
+                <w:between w:val="nil"/>
+              </w:pBdr>
+              <w:spacing w:line="275" w:lineRule="auto"/>
+              <w:rPr>
+                <w:rFonts w:eastAsia="Google Sans" w:cs="Times New Roman"/>
+                <w:sz w:val="18"/>
+                <w:szCs w:val="18"/>
+              </w:rPr>
+            </w:pPr>
+            <w:r>
+              <w:rPr>
+                <w:rFonts w:eastAsia="Google Sans" w:cs="Times New Roman"/>
+                <w:sz w:val="18"/>
+                <w:szCs w:val="18"/>
+              </w:rPr>
+              <w:t>Số tiền thực tế đã nhận được (Cộng dồn).</w:t>
+            </w:r>
+          </w:p>
+        </w:tc>
+      </w:tr>
+      <w:tr>
+        <w:tc>
+          <w:tcPr>
+            <w:tcW w:w="864" w:type="dxa"/>
+          </w:tcPr>
+          <w:p>
+            <w:pPr>
+              <w:pBdr>
+                <w:top w:val="nil"/>
+                <w:left w:val="nil"/>
+                <w:bottom w:val="nil"/>
+                <w:right w:val="nil"/>
+                <w:between w:val="nil"/>
+              </w:pBdr>
+              <w:spacing w:line="275" w:lineRule="auto"/>
+              <w:rPr>
+                <w:rFonts w:eastAsia="Google Sans" w:cs="Times New Roman"/>
+                <w:sz w:val="18"/>
+                <w:szCs w:val="18"/>
+              </w:rPr>
+            </w:pPr>
+            <w:r>
+              <w:rPr>
+                <w:rFonts w:eastAsia="Google Sans" w:cs="Times New Roman"/>
+                <w:sz w:val="18"/>
+                <w:szCs w:val="18"/>
+              </w:rPr>
+              <w:t>1</w:t>
+            </w:r>
+            <w:r>
+              <w:rPr>
+                <w:rFonts w:eastAsia="Google Sans" w:cs="Times New Roman"/>
+                <w:sz w:val="18"/>
+                <w:szCs w:val="18"/>
+              </w:rPr>
+              <w:t>4</w:t>
+            </w:r>
+          </w:p>
+        </w:tc>
+        <w:tc>
+          <w:tcPr>
+            <w:tcW w:w="1008" w:type="dxa"/>
+          </w:tcPr>
+          <w:p>
+            <w:pPr>
+              <w:pBdr>
+                <w:top w:val="nil"/>
+                <w:left w:val="nil"/>
+                <w:bottom w:val="nil"/>
+                <w:right w:val="nil"/>
+                <w:between w:val="nil"/>
+              </w:pBdr>
+              <w:spacing w:line="275" w:lineRule="auto"/>
+              <w:rPr>
+                <w:rFonts w:eastAsia="Google Sans" w:cs="Times New Roman"/>
+                <w:sz w:val="18"/>
+                <w:szCs w:val="18"/>
+              </w:rPr>
+            </w:pPr>
+            <w:r>
+              <w:rPr>
+                <w:rFonts w:eastAsia="Google Sans" w:cs="Times New Roman"/>
+                <w:sz w:val="18"/>
+                <w:szCs w:val="18"/>
+              </w:rPr>
+              <w:t>status</w:t>
+            </w:r>
+          </w:p>
+        </w:tc>
+        <w:tc>
+          <w:tcPr>
+            <w:tcW w:w="1008" w:type="dxa"/>
+          </w:tcPr>
+          <w:p>
+            <w:pPr>
+              <w:pBdr>
+                <w:top w:val="nil"/>
+                <w:left w:val="nil"/>
+                <w:bottom w:val="nil"/>
+                <w:right w:val="nil"/>
+                <w:between w:val="nil"/>
+              </w:pBdr>
+              <w:spacing w:line="275" w:lineRule="auto"/>
+              <w:rPr>
+                <w:rFonts w:eastAsia="Google Sans" w:cs="Times New Roman"/>
+                <w:sz w:val="18"/>
+                <w:szCs w:val="18"/>
+              </w:rPr>
+            </w:pPr>
+            <w:r>
+              <w:rPr>
+                <w:rFonts w:eastAsia="Google Sans" w:cs="Times New Roman"/>
+                <w:sz w:val="18"/>
+                <w:szCs w:val="18"/>
+              </w:rPr>
+              <w:t>tinyint</w:t>
+            </w:r>
+          </w:p>
+        </w:tc>
+        <w:tc>
+          <w:tcPr>
+            <w:tcW w:w="864" w:type="dxa"/>
+          </w:tcPr>
+          <w:p>
+            <w:pPr>
+              <w:pBdr>
+                <w:top w:val="nil"/>
+                <w:left w:val="nil"/>
+                <w:bottom w:val="nil"/>
+                <w:right w:val="nil"/>
+                <w:between w:val="nil"/>
+              </w:pBdr>
+              <w:spacing w:line="275" w:lineRule="auto"/>
+              <w:rPr>
+                <w:rFonts w:eastAsia="Google Sans" w:cs="Times New Roman"/>
+                <w:sz w:val="18"/>
+                <w:szCs w:val="18"/>
+              </w:rPr>
+            </w:pPr>
+            <w:r>
+              <w:rPr>
+                <w:rFonts w:eastAsia="Google Sans" w:cs="Times New Roman"/>
+                <w:sz w:val="18"/>
+                <w:szCs w:val="18"/>
+              </w:rPr>
+              <w:t>1</w:t>
+            </w:r>
+          </w:p>
+        </w:tc>
+        <w:tc>
+          <w:tcPr>
+            <w:tcW w:w="864" w:type="dxa"/>
+          </w:tcPr>
+          <w:p>
+            <w:pPr>
+              <w:pBdr>
+                <w:top w:val="nil"/>
+                <w:left w:val="nil"/>
+                <w:bottom w:val="nil"/>
+                <w:right w:val="nil"/>
+                <w:between w:val="nil"/>
+              </w:pBdr>
+              <w:spacing w:line="275" w:lineRule="auto"/>
+              <w:rPr>
+                <w:rFonts w:eastAsia="Google Sans" w:cs="Times New Roman"/>
+                <w:sz w:val="18"/>
+                <w:szCs w:val="18"/>
+              </w:rPr>
+            </w:pPr>
+          </w:p>
+        </w:tc>
+        <w:tc>
+          <w:tcPr>
+            <w:tcW w:w="864" w:type="dxa"/>
+          </w:tcPr>
+          <w:p>
+            <w:pPr>
+              <w:pBdr>
+                <w:top w:val="nil"/>
+                <w:left w:val="nil"/>
+                <w:bottom w:val="nil"/>
+                <w:right w:val="nil"/>
+                <w:between w:val="nil"/>
+              </w:pBdr>
+              <w:spacing w:line="275" w:lineRule="auto"/>
+              <w:rPr>
+                <w:rFonts w:eastAsia="Google Sans" w:cs="Times New Roman"/>
+                <w:sz w:val="18"/>
+                <w:szCs w:val="18"/>
+              </w:rPr>
+            </w:pPr>
+          </w:p>
+        </w:tc>
+        <w:tc>
+          <w:tcPr>
+            <w:tcW w:w="864" w:type="dxa"/>
+          </w:tcPr>
+          <w:p>
+            <w:pPr>
+              <w:pBdr>
+                <w:top w:val="nil"/>
+                <w:left w:val="nil"/>
+                <w:bottom w:val="nil"/>
+                <w:right w:val="nil"/>
+                <w:between w:val="nil"/>
+              </w:pBdr>
+              <w:spacing w:line="275" w:lineRule="auto"/>
+              <w:rPr>
+                <w:rFonts w:eastAsia="Google Sans" w:cs="Times New Roman"/>
+                <w:sz w:val="18"/>
+                <w:szCs w:val="18"/>
+              </w:rPr>
+            </w:pPr>
+          </w:p>
+        </w:tc>
+        <w:tc>
+          <w:tcPr>
+            <w:tcW w:w="864" w:type="dxa"/>
+          </w:tcPr>
+          <w:p>
+            <w:pPr>
+              <w:pBdr>
+                <w:top w:val="nil"/>
+                <w:left w:val="nil"/>
+                <w:bottom w:val="nil"/>
+                <w:right w:val="nil"/>
+                <w:between w:val="nil"/>
+              </w:pBdr>
+              <w:spacing w:line="275" w:lineRule="auto"/>
+              <w:rPr>
+                <w:rFonts w:eastAsia="Google Sans" w:cs="Times New Roman"/>
+                <w:sz w:val="18"/>
+                <w:szCs w:val="18"/>
+              </w:rPr>
+            </w:pPr>
+          </w:p>
+        </w:tc>
+        <w:tc>
+          <w:tcPr>
+            <w:tcW w:w="864" w:type="dxa"/>
+          </w:tcPr>
+          <w:p>
+            <w:pPr>
+              <w:pBdr>
+                <w:top w:val="nil"/>
+                <w:left w:val="nil"/>
+                <w:bottom w:val="nil"/>
+                <w:right w:val="nil"/>
+                <w:between w:val="nil"/>
+              </w:pBdr>
+              <w:spacing w:line="275" w:lineRule="auto"/>
+              <w:rPr>
+                <w:rFonts w:eastAsia="Google Sans" w:cs="Times New Roman"/>
+                <w:sz w:val="18"/>
+                <w:szCs w:val="18"/>
+              </w:rPr>
+            </w:pPr>
+            <w:r>
+              <w:rPr>
+                <w:rFonts w:eastAsia="Google Sans" w:cs="Times New Roman"/>
+                <w:sz w:val="18"/>
+                <w:szCs w:val="18"/>
+              </w:rPr>
+              <w:t>0</w:t>
+            </w:r>
+          </w:p>
+        </w:tc>
+        <w:tc>
+          <w:tcPr>
+            <w:tcW w:w="2304" w:type="dxa"/>
+          </w:tcPr>
+          <w:p>
+            <w:pPr>
+              <w:pBdr>
+                <w:top w:val="nil"/>
+                <w:left w:val="nil"/>
+                <w:bottom w:val="nil"/>
+                <w:right w:val="nil"/>
+                <w:between w:val="nil"/>
+              </w:pBdr>
+              <w:spacing w:line="275" w:lineRule="auto"/>
+              <w:rPr>
+                <w:rFonts w:eastAsia="Google Sans" w:cs="Times New Roman"/>
+                <w:sz w:val="18"/>
+                <w:szCs w:val="18"/>
+              </w:rPr>
+            </w:pPr>
+            <w:r>
+              <w:rPr>
+                <w:rFonts w:eastAsia="Google Sans" w:cs="Times New Roman"/>
+                <w:sz w:val="18"/>
+                <w:szCs w:val="18"/>
+              </w:rPr>
+              <w:t>0=Mới, 1=Đang chạy, 2=Đã kết thúc, 3=Đóng.</w:t>
+            </w:r>
+          </w:p>
+        </w:tc>
+      </w:tr>
+      <w:tr>
+        <w:tc>
+          <w:tcPr>
+            <w:tcW w:w="864" w:type="dxa"/>
+          </w:tcPr>
+          <w:p>
+            <w:pPr>
+              <w:pBdr>
+                <w:top w:val="nil"/>
+                <w:left w:val="nil"/>
+                <w:bottom w:val="nil"/>
+                <w:right w:val="nil"/>
+                <w:between w:val="nil"/>
+              </w:pBdr>
+              <w:spacing w:line="275" w:lineRule="auto"/>
+              <w:rPr>
+                <w:rFonts w:eastAsia="Google Sans" w:cs="Times New Roman"/>
+                <w:sz w:val="18"/>
+                <w:szCs w:val="18"/>
+              </w:rPr>
+            </w:pPr>
+            <w:r>
+              <w:rPr>
+                <w:rFonts w:eastAsia="Google Sans" w:cs="Times New Roman"/>
+                <w:sz w:val="18"/>
+                <w:szCs w:val="18"/>
+              </w:rPr>
+              <w:t>1</w:t>
+            </w:r>
+            <w:r>
+              <w:rPr>
+                <w:rFonts w:eastAsia="Google Sans" w:cs="Times New Roman"/>
+                <w:sz w:val="18"/>
+                <w:szCs w:val="18"/>
+              </w:rPr>
+              <w:t>5</w:t>
             </w:r>
           </w:p>
         </w:tc>
@@ -15585,6 +16217,7 @@
                 <w:sz w:val="18"/>
                 <w:szCs w:val="18"/>
               </w:rPr>
+              <w:lastRenderedPageBreak/>
               <w:t>7</w:t>
             </w:r>
           </w:p>
@@ -16325,16 +16958,7 @@
                 <w:sz w:val="18"/>
                 <w:szCs w:val="18"/>
               </w:rPr>
-              <w:t>CURRE</w:t>
-            </w:r>
-            <w:r>
-              <w:rPr>
-                <w:rFonts w:eastAsia="Google Sans" w:cs="Times New Roman"/>
-                <w:sz w:val="18"/>
-                <w:szCs w:val="18"/>
-              </w:rPr>
-              <w:lastRenderedPageBreak/>
-              <w:t>NT</w:t>
+              <w:t>CURRENT</w:t>
             </w:r>
           </w:p>
         </w:tc>
@@ -16364,17 +16988,1795 @@
                 <w:sz w:val="18"/>
                 <w:szCs w:val="18"/>
               </w:rPr>
-              <w:lastRenderedPageBreak/>
-              <w:t xml:space="preserve">Ngày giờ tạo yêu cầu </w:t>
-            </w:r>
-            <w:r>
-              <w:rPr>
-                <w:rFonts w:eastAsia="Google Sans" w:cs="Times New Roman"/>
-                <w:sz w:val="18"/>
-                <w:szCs w:val="18"/>
-              </w:rPr>
-              <w:lastRenderedPageBreak/>
-              <w:t>quyên góp.</w:t>
+              <w:t>Ngày giờ tạo yêu cầu quyên góp.</w:t>
+            </w:r>
+          </w:p>
+        </w:tc>
+      </w:tr>
+    </w:tbl>
+    <w:p>
+      <w:pPr>
+        <w:pBdr>
+          <w:top w:val="nil"/>
+          <w:left w:val="nil"/>
+          <w:bottom w:val="nil"/>
+          <w:right w:val="nil"/>
+          <w:between w:val="nil"/>
+        </w:pBdr>
+        <w:spacing w:before="480" w:line="275" w:lineRule="auto"/>
+        <w:rPr>
+          <w:rFonts w:eastAsia="Google Sans" w:cs="Times New Roman"/>
+          <w:b/>
+          <w:bCs/>
+        </w:rPr>
+      </w:pPr>
+      <w:r>
+        <w:rPr>
+          <w:rFonts w:eastAsia="Google Sans" w:cs="Times New Roman"/>
+          <w:b/>
+          <w:bCs/>
+        </w:rPr>
+        <w:t>8</w:t>
+      </w:r>
+      <w:r>
+        <w:rPr>
+          <w:rFonts w:eastAsia="Google Sans" w:cs="Times New Roman"/>
+          <w:b/>
+          <w:bCs/>
+        </w:rPr>
+        <w:t xml:space="preserve">. </w:t>
+      </w:r>
+      <w:r>
+        <w:rPr>
+          <w:rFonts w:eastAsia="Google Sans" w:cs="Times New Roman"/>
+          <w:b/>
+          <w:bCs/>
+        </w:rPr>
+        <w:t>user_following</w:t>
+      </w:r>
+    </w:p>
+    <w:tbl>
+      <w:tblPr>
+        <w:tblStyle w:val="GridTable4-Accent6"/>
+        <w:tblW w:w="10368" w:type="dxa"/>
+        <w:tblLayout w:type="fixed"/>
+        <w:tblCellMar>
+          <w:top w:w="43" w:type="dxa"/>
+          <w:bottom w:w="43" w:type="dxa"/>
+        </w:tblCellMar>
+        <w:tblLook w:val="0620" w:firstRow="1" w:lastRow="0" w:firstColumn="0" w:lastColumn="0" w:noHBand="1" w:noVBand="1"/>
+      </w:tblPr>
+      <w:tblGrid>
+        <w:gridCol w:w="864"/>
+        <w:gridCol w:w="1152"/>
+        <w:gridCol w:w="1152"/>
+        <w:gridCol w:w="864"/>
+        <w:gridCol w:w="864"/>
+        <w:gridCol w:w="864"/>
+        <w:gridCol w:w="864"/>
+        <w:gridCol w:w="864"/>
+        <w:gridCol w:w="864"/>
+        <w:gridCol w:w="2016"/>
+      </w:tblGrid>
+      <w:tr>
+        <w:trPr>
+          <w:cnfStyle w:val="100000000000" w:firstRow="1" w:lastRow="0" w:firstColumn="0" w:lastColumn="0" w:oddVBand="0" w:evenVBand="0" w:oddHBand="0" w:evenHBand="0" w:firstRowFirstColumn="0" w:firstRowLastColumn="0" w:lastRowFirstColumn="0" w:lastRowLastColumn="0"/>
+        </w:trPr>
+        <w:tc>
+          <w:tcPr>
+            <w:tcW w:w="864" w:type="dxa"/>
+          </w:tcPr>
+          <w:p>
+            <w:pPr>
+              <w:pBdr>
+                <w:top w:val="nil"/>
+                <w:left w:val="nil"/>
+                <w:bottom w:val="nil"/>
+                <w:right w:val="nil"/>
+                <w:between w:val="nil"/>
+              </w:pBdr>
+              <w:spacing w:line="275" w:lineRule="auto"/>
+              <w:rPr>
+                <w:rFonts w:eastAsia="Google Sans" w:cs="Times New Roman"/>
+                <w:b w:val="0"/>
+                <w:bCs w:val="0"/>
+                <w:sz w:val="18"/>
+                <w:szCs w:val="18"/>
+              </w:rPr>
+            </w:pPr>
+            <w:r>
+              <w:rPr>
+                <w:rFonts w:eastAsia="Google Sans" w:cs="Times New Roman"/>
+                <w:sz w:val="18"/>
+                <w:szCs w:val="18"/>
+              </w:rPr>
+              <w:t>No</w:t>
+            </w:r>
+          </w:p>
+        </w:tc>
+        <w:tc>
+          <w:tcPr>
+            <w:tcW w:w="1152" w:type="dxa"/>
+          </w:tcPr>
+          <w:p>
+            <w:pPr>
+              <w:pBdr>
+                <w:top w:val="nil"/>
+                <w:left w:val="nil"/>
+                <w:bottom w:val="nil"/>
+                <w:right w:val="nil"/>
+                <w:between w:val="nil"/>
+              </w:pBdr>
+              <w:spacing w:line="275" w:lineRule="auto"/>
+              <w:rPr>
+                <w:rFonts w:eastAsia="Google Sans" w:cs="Times New Roman"/>
+                <w:b w:val="0"/>
+                <w:bCs w:val="0"/>
+                <w:sz w:val="18"/>
+                <w:szCs w:val="18"/>
+              </w:rPr>
+            </w:pPr>
+            <w:r>
+              <w:rPr>
+                <w:rFonts w:eastAsia="Google Sans" w:cs="Times New Roman"/>
+                <w:sz w:val="18"/>
+                <w:szCs w:val="18"/>
+              </w:rPr>
+              <w:t>Field Name</w:t>
+            </w:r>
+          </w:p>
+        </w:tc>
+        <w:tc>
+          <w:tcPr>
+            <w:tcW w:w="1152" w:type="dxa"/>
+          </w:tcPr>
+          <w:p>
+            <w:pPr>
+              <w:pBdr>
+                <w:top w:val="nil"/>
+                <w:left w:val="nil"/>
+                <w:bottom w:val="nil"/>
+                <w:right w:val="nil"/>
+                <w:between w:val="nil"/>
+              </w:pBdr>
+              <w:spacing w:line="275" w:lineRule="auto"/>
+              <w:rPr>
+                <w:rFonts w:eastAsia="Google Sans" w:cs="Times New Roman"/>
+                <w:b w:val="0"/>
+                <w:bCs w:val="0"/>
+                <w:sz w:val="18"/>
+                <w:szCs w:val="18"/>
+              </w:rPr>
+            </w:pPr>
+            <w:r>
+              <w:rPr>
+                <w:rFonts w:eastAsia="Google Sans" w:cs="Times New Roman"/>
+                <w:sz w:val="18"/>
+                <w:szCs w:val="18"/>
+              </w:rPr>
+              <w:t>Type</w:t>
+            </w:r>
+          </w:p>
+        </w:tc>
+        <w:tc>
+          <w:tcPr>
+            <w:tcW w:w="864" w:type="dxa"/>
+          </w:tcPr>
+          <w:p>
+            <w:pPr>
+              <w:pBdr>
+                <w:top w:val="nil"/>
+                <w:left w:val="nil"/>
+                <w:bottom w:val="nil"/>
+                <w:right w:val="nil"/>
+                <w:between w:val="nil"/>
+              </w:pBdr>
+              <w:spacing w:line="275" w:lineRule="auto"/>
+              <w:rPr>
+                <w:rFonts w:eastAsia="Google Sans" w:cs="Times New Roman"/>
+                <w:b w:val="0"/>
+                <w:bCs w:val="0"/>
+                <w:sz w:val="18"/>
+                <w:szCs w:val="18"/>
+              </w:rPr>
+            </w:pPr>
+            <w:r>
+              <w:rPr>
+                <w:rFonts w:eastAsia="Google Sans" w:cs="Times New Roman"/>
+                <w:sz w:val="18"/>
+                <w:szCs w:val="18"/>
+              </w:rPr>
+              <w:t>Length</w:t>
+            </w:r>
+          </w:p>
+        </w:tc>
+        <w:tc>
+          <w:tcPr>
+            <w:tcW w:w="864" w:type="dxa"/>
+          </w:tcPr>
+          <w:p>
+            <w:pPr>
+              <w:pBdr>
+                <w:top w:val="nil"/>
+                <w:left w:val="nil"/>
+                <w:bottom w:val="nil"/>
+                <w:right w:val="nil"/>
+                <w:between w:val="nil"/>
+              </w:pBdr>
+              <w:spacing w:line="275" w:lineRule="auto"/>
+              <w:rPr>
+                <w:rFonts w:eastAsia="Google Sans" w:cs="Times New Roman"/>
+                <w:b w:val="0"/>
+                <w:bCs w:val="0"/>
+                <w:sz w:val="18"/>
+                <w:szCs w:val="18"/>
+              </w:rPr>
+            </w:pPr>
+            <w:r>
+              <w:rPr>
+                <w:rFonts w:eastAsia="Google Sans" w:cs="Times New Roman"/>
+                <w:sz w:val="18"/>
+                <w:szCs w:val="18"/>
+              </w:rPr>
+              <w:t>Size</w:t>
+            </w:r>
+          </w:p>
+        </w:tc>
+        <w:tc>
+          <w:tcPr>
+            <w:tcW w:w="864" w:type="dxa"/>
+          </w:tcPr>
+          <w:p>
+            <w:pPr>
+              <w:pBdr>
+                <w:top w:val="nil"/>
+                <w:left w:val="nil"/>
+                <w:bottom w:val="nil"/>
+                <w:right w:val="nil"/>
+                <w:between w:val="nil"/>
+              </w:pBdr>
+              <w:spacing w:line="275" w:lineRule="auto"/>
+              <w:rPr>
+                <w:rFonts w:eastAsia="Google Sans" w:cs="Times New Roman"/>
+                <w:b w:val="0"/>
+                <w:bCs w:val="0"/>
+                <w:sz w:val="18"/>
+                <w:szCs w:val="18"/>
+              </w:rPr>
+            </w:pPr>
+            <w:r>
+              <w:rPr>
+                <w:rFonts w:eastAsia="Google Sans" w:cs="Times New Roman"/>
+                <w:sz w:val="18"/>
+                <w:szCs w:val="18"/>
+              </w:rPr>
+              <w:t>Null</w:t>
+            </w:r>
+          </w:p>
+        </w:tc>
+        <w:tc>
+          <w:tcPr>
+            <w:tcW w:w="864" w:type="dxa"/>
+          </w:tcPr>
+          <w:p>
+            <w:pPr>
+              <w:pBdr>
+                <w:top w:val="nil"/>
+                <w:left w:val="nil"/>
+                <w:bottom w:val="nil"/>
+                <w:right w:val="nil"/>
+                <w:between w:val="nil"/>
+              </w:pBdr>
+              <w:spacing w:line="275" w:lineRule="auto"/>
+              <w:rPr>
+                <w:rFonts w:eastAsia="Google Sans" w:cs="Times New Roman"/>
+                <w:b w:val="0"/>
+                <w:bCs w:val="0"/>
+                <w:sz w:val="18"/>
+                <w:szCs w:val="18"/>
+              </w:rPr>
+            </w:pPr>
+            <w:r>
+              <w:rPr>
+                <w:rFonts w:eastAsia="Google Sans" w:cs="Times New Roman"/>
+                <w:sz w:val="18"/>
+                <w:szCs w:val="18"/>
+              </w:rPr>
+              <w:t>Unique</w:t>
+            </w:r>
+          </w:p>
+        </w:tc>
+        <w:tc>
+          <w:tcPr>
+            <w:tcW w:w="864" w:type="dxa"/>
+          </w:tcPr>
+          <w:p>
+            <w:pPr>
+              <w:pBdr>
+                <w:top w:val="nil"/>
+                <w:left w:val="nil"/>
+                <w:bottom w:val="nil"/>
+                <w:right w:val="nil"/>
+                <w:between w:val="nil"/>
+              </w:pBdr>
+              <w:spacing w:line="275" w:lineRule="auto"/>
+              <w:rPr>
+                <w:rFonts w:eastAsia="Google Sans" w:cs="Times New Roman"/>
+                <w:b w:val="0"/>
+                <w:bCs w:val="0"/>
+                <w:sz w:val="18"/>
+                <w:szCs w:val="18"/>
+              </w:rPr>
+            </w:pPr>
+            <w:r>
+              <w:rPr>
+                <w:rFonts w:eastAsia="Google Sans" w:cs="Times New Roman"/>
+                <w:sz w:val="18"/>
+                <w:szCs w:val="18"/>
+              </w:rPr>
+              <w:t>P/F Key</w:t>
+            </w:r>
+          </w:p>
+        </w:tc>
+        <w:tc>
+          <w:tcPr>
+            <w:tcW w:w="864" w:type="dxa"/>
+          </w:tcPr>
+          <w:p>
+            <w:pPr>
+              <w:pBdr>
+                <w:top w:val="nil"/>
+                <w:left w:val="nil"/>
+                <w:bottom w:val="nil"/>
+                <w:right w:val="nil"/>
+                <w:between w:val="nil"/>
+              </w:pBdr>
+              <w:spacing w:line="275" w:lineRule="auto"/>
+              <w:rPr>
+                <w:rFonts w:eastAsia="Google Sans" w:cs="Times New Roman"/>
+                <w:b w:val="0"/>
+                <w:bCs w:val="0"/>
+                <w:sz w:val="18"/>
+                <w:szCs w:val="18"/>
+              </w:rPr>
+            </w:pPr>
+            <w:r>
+              <w:rPr>
+                <w:rFonts w:eastAsia="Google Sans" w:cs="Times New Roman"/>
+                <w:sz w:val="18"/>
+                <w:szCs w:val="18"/>
+              </w:rPr>
+              <w:t>Default</w:t>
+            </w:r>
+          </w:p>
+        </w:tc>
+        <w:tc>
+          <w:tcPr>
+            <w:tcW w:w="2016" w:type="dxa"/>
+          </w:tcPr>
+          <w:p>
+            <w:pPr>
+              <w:pBdr>
+                <w:top w:val="nil"/>
+                <w:left w:val="nil"/>
+                <w:bottom w:val="nil"/>
+                <w:right w:val="nil"/>
+                <w:between w:val="nil"/>
+              </w:pBdr>
+              <w:spacing w:line="275" w:lineRule="auto"/>
+              <w:rPr>
+                <w:rFonts w:eastAsia="Google Sans" w:cs="Times New Roman"/>
+                <w:b w:val="0"/>
+                <w:bCs w:val="0"/>
+                <w:sz w:val="18"/>
+                <w:szCs w:val="18"/>
+              </w:rPr>
+            </w:pPr>
+            <w:r>
+              <w:rPr>
+                <w:rFonts w:eastAsia="Google Sans" w:cs="Times New Roman"/>
+                <w:sz w:val="18"/>
+                <w:szCs w:val="18"/>
+              </w:rPr>
+              <w:t>Description</w:t>
+            </w:r>
+          </w:p>
+        </w:tc>
+      </w:tr>
+      <w:tr>
+        <w:tc>
+          <w:tcPr>
+            <w:tcW w:w="864" w:type="dxa"/>
+          </w:tcPr>
+          <w:p>
+            <w:pPr>
+              <w:pBdr>
+                <w:top w:val="nil"/>
+                <w:left w:val="nil"/>
+                <w:bottom w:val="nil"/>
+                <w:right w:val="nil"/>
+                <w:between w:val="nil"/>
+              </w:pBdr>
+              <w:spacing w:line="275" w:lineRule="auto"/>
+              <w:rPr>
+                <w:rFonts w:eastAsia="Google Sans" w:cs="Times New Roman"/>
+                <w:sz w:val="18"/>
+                <w:szCs w:val="18"/>
+              </w:rPr>
+            </w:pPr>
+            <w:r>
+              <w:rPr>
+                <w:rFonts w:eastAsia="Google Sans" w:cs="Times New Roman"/>
+                <w:sz w:val="18"/>
+                <w:szCs w:val="18"/>
+              </w:rPr>
+              <w:t>1</w:t>
+            </w:r>
+          </w:p>
+        </w:tc>
+        <w:tc>
+          <w:tcPr>
+            <w:tcW w:w="1152" w:type="dxa"/>
+          </w:tcPr>
+          <w:p>
+            <w:pPr>
+              <w:pBdr>
+                <w:top w:val="nil"/>
+                <w:left w:val="nil"/>
+                <w:bottom w:val="nil"/>
+                <w:right w:val="nil"/>
+                <w:between w:val="nil"/>
+              </w:pBdr>
+              <w:spacing w:line="275" w:lineRule="auto"/>
+              <w:rPr>
+                <w:rFonts w:eastAsia="Google Sans" w:cs="Times New Roman"/>
+                <w:sz w:val="18"/>
+                <w:szCs w:val="18"/>
+              </w:rPr>
+            </w:pPr>
+            <w:r>
+              <w:rPr>
+                <w:rFonts w:eastAsia="Google Sans" w:cs="Times New Roman"/>
+                <w:sz w:val="18"/>
+                <w:szCs w:val="18"/>
+              </w:rPr>
+              <w:t>id</w:t>
+            </w:r>
+          </w:p>
+        </w:tc>
+        <w:tc>
+          <w:tcPr>
+            <w:tcW w:w="1152" w:type="dxa"/>
+          </w:tcPr>
+          <w:p>
+            <w:pPr>
+              <w:pBdr>
+                <w:top w:val="nil"/>
+                <w:left w:val="nil"/>
+                <w:bottom w:val="nil"/>
+                <w:right w:val="nil"/>
+                <w:between w:val="nil"/>
+              </w:pBdr>
+              <w:spacing w:line="275" w:lineRule="auto"/>
+              <w:rPr>
+                <w:rFonts w:eastAsia="Google Sans" w:cs="Times New Roman"/>
+                <w:sz w:val="18"/>
+                <w:szCs w:val="18"/>
+              </w:rPr>
+            </w:pPr>
+            <w:r>
+              <w:rPr>
+                <w:rFonts w:eastAsia="Google Sans" w:cs="Times New Roman"/>
+                <w:sz w:val="18"/>
+                <w:szCs w:val="18"/>
+              </w:rPr>
+              <w:t>int</w:t>
+            </w:r>
+          </w:p>
+        </w:tc>
+        <w:tc>
+          <w:tcPr>
+            <w:tcW w:w="864" w:type="dxa"/>
+          </w:tcPr>
+          <w:p>
+            <w:pPr>
+              <w:pBdr>
+                <w:top w:val="nil"/>
+                <w:left w:val="nil"/>
+                <w:bottom w:val="nil"/>
+                <w:right w:val="nil"/>
+                <w:between w:val="nil"/>
+              </w:pBdr>
+              <w:spacing w:line="275" w:lineRule="auto"/>
+              <w:rPr>
+                <w:rFonts w:eastAsia="Google Sans" w:cs="Times New Roman"/>
+                <w:sz w:val="18"/>
+                <w:szCs w:val="18"/>
+              </w:rPr>
+            </w:pPr>
+            <w:r>
+              <w:rPr>
+                <w:rFonts w:eastAsia="Google Sans" w:cs="Times New Roman"/>
+                <w:sz w:val="18"/>
+                <w:szCs w:val="18"/>
+              </w:rPr>
+              <w:t>11</w:t>
+            </w:r>
+          </w:p>
+        </w:tc>
+        <w:tc>
+          <w:tcPr>
+            <w:tcW w:w="864" w:type="dxa"/>
+          </w:tcPr>
+          <w:p>
+            <w:pPr>
+              <w:pBdr>
+                <w:top w:val="nil"/>
+                <w:left w:val="nil"/>
+                <w:bottom w:val="nil"/>
+                <w:right w:val="nil"/>
+                <w:between w:val="nil"/>
+              </w:pBdr>
+              <w:spacing w:line="275" w:lineRule="auto"/>
+              <w:rPr>
+                <w:rFonts w:eastAsia="Google Sans" w:cs="Times New Roman"/>
+                <w:sz w:val="18"/>
+                <w:szCs w:val="18"/>
+              </w:rPr>
+            </w:pPr>
+          </w:p>
+        </w:tc>
+        <w:tc>
+          <w:tcPr>
+            <w:tcW w:w="864" w:type="dxa"/>
+          </w:tcPr>
+          <w:p>
+            <w:pPr>
+              <w:pBdr>
+                <w:top w:val="nil"/>
+                <w:left w:val="nil"/>
+                <w:bottom w:val="nil"/>
+                <w:right w:val="nil"/>
+                <w:between w:val="nil"/>
+              </w:pBdr>
+              <w:spacing w:line="275" w:lineRule="auto"/>
+              <w:rPr>
+                <w:rFonts w:eastAsia="Google Sans" w:cs="Times New Roman"/>
+                <w:sz w:val="18"/>
+                <w:szCs w:val="18"/>
+              </w:rPr>
+            </w:pPr>
+          </w:p>
+        </w:tc>
+        <w:tc>
+          <w:tcPr>
+            <w:tcW w:w="864" w:type="dxa"/>
+          </w:tcPr>
+          <w:p>
+            <w:pPr>
+              <w:pBdr>
+                <w:top w:val="nil"/>
+                <w:left w:val="nil"/>
+                <w:bottom w:val="nil"/>
+                <w:right w:val="nil"/>
+                <w:between w:val="nil"/>
+              </w:pBdr>
+              <w:spacing w:line="275" w:lineRule="auto"/>
+              <w:rPr>
+                <w:rFonts w:eastAsia="Google Sans" w:cs="Times New Roman"/>
+                <w:sz w:val="18"/>
+                <w:szCs w:val="18"/>
+              </w:rPr>
+            </w:pPr>
+          </w:p>
+        </w:tc>
+        <w:tc>
+          <w:tcPr>
+            <w:tcW w:w="864" w:type="dxa"/>
+          </w:tcPr>
+          <w:p>
+            <w:pPr>
+              <w:pBdr>
+                <w:top w:val="nil"/>
+                <w:left w:val="nil"/>
+                <w:bottom w:val="nil"/>
+                <w:right w:val="nil"/>
+                <w:between w:val="nil"/>
+              </w:pBdr>
+              <w:spacing w:line="275" w:lineRule="auto"/>
+              <w:rPr>
+                <w:rFonts w:eastAsia="Google Sans" w:cs="Times New Roman"/>
+                <w:sz w:val="18"/>
+                <w:szCs w:val="18"/>
+              </w:rPr>
+            </w:pPr>
+            <w:r>
+              <w:rPr>
+                <w:rFonts w:eastAsia="Google Sans" w:cs="Times New Roman"/>
+                <w:sz w:val="18"/>
+                <w:szCs w:val="18"/>
+              </w:rPr>
+              <w:t>P</w:t>
+            </w:r>
+          </w:p>
+        </w:tc>
+        <w:tc>
+          <w:tcPr>
+            <w:tcW w:w="864" w:type="dxa"/>
+          </w:tcPr>
+          <w:p>
+            <w:pPr>
+              <w:pBdr>
+                <w:top w:val="nil"/>
+                <w:left w:val="nil"/>
+                <w:bottom w:val="nil"/>
+                <w:right w:val="nil"/>
+                <w:between w:val="nil"/>
+              </w:pBdr>
+              <w:spacing w:line="275" w:lineRule="auto"/>
+              <w:rPr>
+                <w:rFonts w:eastAsia="Google Sans" w:cs="Times New Roman"/>
+                <w:sz w:val="18"/>
+                <w:szCs w:val="18"/>
+              </w:rPr>
+            </w:pPr>
+            <w:r>
+              <w:rPr>
+                <w:rFonts w:eastAsia="Google Sans" w:cs="Times New Roman"/>
+                <w:sz w:val="18"/>
+                <w:szCs w:val="18"/>
+              </w:rPr>
+              <w:t>Auto</w:t>
+            </w:r>
+          </w:p>
+        </w:tc>
+        <w:tc>
+          <w:tcPr>
+            <w:tcW w:w="2016" w:type="dxa"/>
+          </w:tcPr>
+          <w:p>
+            <w:pPr>
+              <w:pBdr>
+                <w:top w:val="nil"/>
+                <w:left w:val="nil"/>
+                <w:bottom w:val="nil"/>
+                <w:right w:val="nil"/>
+                <w:between w:val="nil"/>
+              </w:pBdr>
+              <w:spacing w:line="275" w:lineRule="auto"/>
+              <w:rPr>
+                <w:rFonts w:eastAsia="Google Sans" w:cs="Times New Roman"/>
+                <w:sz w:val="18"/>
+                <w:szCs w:val="18"/>
+              </w:rPr>
+            </w:pPr>
+            <w:r>
+              <w:rPr>
+                <w:rFonts w:eastAsia="Google Sans" w:cs="Times New Roman"/>
+                <w:sz w:val="18"/>
+                <w:szCs w:val="18"/>
+              </w:rPr>
+              <w:t>Khóa chính.</w:t>
+            </w:r>
+          </w:p>
+        </w:tc>
+      </w:tr>
+      <w:tr>
+        <w:tc>
+          <w:tcPr>
+            <w:tcW w:w="864" w:type="dxa"/>
+          </w:tcPr>
+          <w:p>
+            <w:pPr>
+              <w:pBdr>
+                <w:top w:val="nil"/>
+                <w:left w:val="nil"/>
+                <w:bottom w:val="nil"/>
+                <w:right w:val="nil"/>
+                <w:between w:val="nil"/>
+              </w:pBdr>
+              <w:spacing w:line="275" w:lineRule="auto"/>
+              <w:rPr>
+                <w:rFonts w:eastAsia="Google Sans" w:cs="Times New Roman"/>
+                <w:sz w:val="18"/>
+                <w:szCs w:val="18"/>
+              </w:rPr>
+            </w:pPr>
+            <w:r>
+              <w:rPr>
+                <w:rFonts w:eastAsia="Google Sans" w:cs="Times New Roman"/>
+                <w:sz w:val="18"/>
+                <w:szCs w:val="18"/>
+              </w:rPr>
+              <w:t>2</w:t>
+            </w:r>
+          </w:p>
+        </w:tc>
+        <w:tc>
+          <w:tcPr>
+            <w:tcW w:w="1152" w:type="dxa"/>
+          </w:tcPr>
+          <w:p>
+            <w:pPr>
+              <w:pBdr>
+                <w:top w:val="nil"/>
+                <w:left w:val="nil"/>
+                <w:bottom w:val="nil"/>
+                <w:right w:val="nil"/>
+                <w:between w:val="nil"/>
+              </w:pBdr>
+              <w:spacing w:line="275" w:lineRule="auto"/>
+              <w:rPr>
+                <w:rFonts w:eastAsia="Google Sans" w:cs="Times New Roman"/>
+                <w:sz w:val="18"/>
+                <w:szCs w:val="18"/>
+              </w:rPr>
+            </w:pPr>
+            <w:r>
+              <w:rPr>
+                <w:rFonts w:eastAsia="Google Sans" w:cs="Times New Roman"/>
+                <w:sz w:val="18"/>
+                <w:szCs w:val="18"/>
+              </w:rPr>
+              <w:t>user_id</w:t>
+            </w:r>
+          </w:p>
+        </w:tc>
+        <w:tc>
+          <w:tcPr>
+            <w:tcW w:w="1152" w:type="dxa"/>
+          </w:tcPr>
+          <w:p>
+            <w:pPr>
+              <w:pBdr>
+                <w:top w:val="nil"/>
+                <w:left w:val="nil"/>
+                <w:bottom w:val="nil"/>
+                <w:right w:val="nil"/>
+                <w:between w:val="nil"/>
+              </w:pBdr>
+              <w:spacing w:line="275" w:lineRule="auto"/>
+              <w:rPr>
+                <w:rFonts w:eastAsia="Google Sans" w:cs="Times New Roman"/>
+                <w:sz w:val="18"/>
+                <w:szCs w:val="18"/>
+              </w:rPr>
+            </w:pPr>
+            <w:r>
+              <w:rPr>
+                <w:rFonts w:eastAsia="Google Sans" w:cs="Times New Roman"/>
+                <w:sz w:val="18"/>
+                <w:szCs w:val="18"/>
+              </w:rPr>
+              <w:t>int</w:t>
+            </w:r>
+          </w:p>
+        </w:tc>
+        <w:tc>
+          <w:tcPr>
+            <w:tcW w:w="864" w:type="dxa"/>
+          </w:tcPr>
+          <w:p>
+            <w:pPr>
+              <w:pBdr>
+                <w:top w:val="nil"/>
+                <w:left w:val="nil"/>
+                <w:bottom w:val="nil"/>
+                <w:right w:val="nil"/>
+                <w:between w:val="nil"/>
+              </w:pBdr>
+              <w:spacing w:line="275" w:lineRule="auto"/>
+              <w:rPr>
+                <w:rFonts w:eastAsia="Google Sans" w:cs="Times New Roman"/>
+                <w:sz w:val="18"/>
+                <w:szCs w:val="18"/>
+              </w:rPr>
+            </w:pPr>
+            <w:r>
+              <w:rPr>
+                <w:rFonts w:eastAsia="Google Sans" w:cs="Times New Roman"/>
+                <w:sz w:val="18"/>
+                <w:szCs w:val="18"/>
+              </w:rPr>
+              <w:t>11</w:t>
+            </w:r>
+          </w:p>
+        </w:tc>
+        <w:tc>
+          <w:tcPr>
+            <w:tcW w:w="864" w:type="dxa"/>
+          </w:tcPr>
+          <w:p>
+            <w:pPr>
+              <w:pBdr>
+                <w:top w:val="nil"/>
+                <w:left w:val="nil"/>
+                <w:bottom w:val="nil"/>
+                <w:right w:val="nil"/>
+                <w:between w:val="nil"/>
+              </w:pBdr>
+              <w:spacing w:line="275" w:lineRule="auto"/>
+              <w:rPr>
+                <w:rFonts w:eastAsia="Google Sans" w:cs="Times New Roman"/>
+                <w:sz w:val="18"/>
+                <w:szCs w:val="18"/>
+              </w:rPr>
+            </w:pPr>
+          </w:p>
+        </w:tc>
+        <w:tc>
+          <w:tcPr>
+            <w:tcW w:w="864" w:type="dxa"/>
+          </w:tcPr>
+          <w:p>
+            <w:pPr>
+              <w:pBdr>
+                <w:top w:val="nil"/>
+                <w:left w:val="nil"/>
+                <w:bottom w:val="nil"/>
+                <w:right w:val="nil"/>
+                <w:between w:val="nil"/>
+              </w:pBdr>
+              <w:spacing w:line="275" w:lineRule="auto"/>
+              <w:rPr>
+                <w:rFonts w:eastAsia="Google Sans" w:cs="Times New Roman"/>
+                <w:sz w:val="18"/>
+                <w:szCs w:val="18"/>
+              </w:rPr>
+            </w:pPr>
+            <w:r>
+              <w:rPr>
+                <w:rFonts w:eastAsia="Google Sans" w:cs="Times New Roman"/>
+                <w:sz w:val="18"/>
+                <w:szCs w:val="18"/>
+              </w:rPr>
+              <w:t>x</w:t>
+            </w:r>
+          </w:p>
+        </w:tc>
+        <w:tc>
+          <w:tcPr>
+            <w:tcW w:w="864" w:type="dxa"/>
+          </w:tcPr>
+          <w:p>
+            <w:pPr>
+              <w:pBdr>
+                <w:top w:val="nil"/>
+                <w:left w:val="nil"/>
+                <w:bottom w:val="nil"/>
+                <w:right w:val="nil"/>
+                <w:between w:val="nil"/>
+              </w:pBdr>
+              <w:spacing w:line="275" w:lineRule="auto"/>
+              <w:rPr>
+                <w:rFonts w:eastAsia="Google Sans" w:cs="Times New Roman"/>
+                <w:sz w:val="18"/>
+                <w:szCs w:val="18"/>
+              </w:rPr>
+            </w:pPr>
+          </w:p>
+        </w:tc>
+        <w:tc>
+          <w:tcPr>
+            <w:tcW w:w="864" w:type="dxa"/>
+          </w:tcPr>
+          <w:p>
+            <w:pPr>
+              <w:pBdr>
+                <w:top w:val="nil"/>
+                <w:left w:val="nil"/>
+                <w:bottom w:val="nil"/>
+                <w:right w:val="nil"/>
+                <w:between w:val="nil"/>
+              </w:pBdr>
+              <w:spacing w:line="275" w:lineRule="auto"/>
+              <w:rPr>
+                <w:rFonts w:eastAsia="Google Sans" w:cs="Times New Roman"/>
+                <w:sz w:val="18"/>
+                <w:szCs w:val="18"/>
+              </w:rPr>
+            </w:pPr>
+            <w:r>
+              <w:rPr>
+                <w:rFonts w:eastAsia="Google Sans" w:cs="Times New Roman"/>
+                <w:sz w:val="18"/>
+                <w:szCs w:val="18"/>
+              </w:rPr>
+              <w:t>F</w:t>
+            </w:r>
+          </w:p>
+        </w:tc>
+        <w:tc>
+          <w:tcPr>
+            <w:tcW w:w="864" w:type="dxa"/>
+          </w:tcPr>
+          <w:p>
+            <w:pPr>
+              <w:pBdr>
+                <w:top w:val="nil"/>
+                <w:left w:val="nil"/>
+                <w:bottom w:val="nil"/>
+                <w:right w:val="nil"/>
+                <w:between w:val="nil"/>
+              </w:pBdr>
+              <w:spacing w:line="275" w:lineRule="auto"/>
+              <w:rPr>
+                <w:rFonts w:eastAsia="Google Sans" w:cs="Times New Roman"/>
+                <w:sz w:val="18"/>
+                <w:szCs w:val="18"/>
+              </w:rPr>
+            </w:pPr>
+          </w:p>
+        </w:tc>
+        <w:tc>
+          <w:tcPr>
+            <w:tcW w:w="2016" w:type="dxa"/>
+          </w:tcPr>
+          <w:p>
+            <w:pPr>
+              <w:pBdr>
+                <w:top w:val="nil"/>
+                <w:left w:val="nil"/>
+                <w:bottom w:val="nil"/>
+                <w:right w:val="nil"/>
+                <w:between w:val="nil"/>
+              </w:pBdr>
+              <w:spacing w:line="275" w:lineRule="auto"/>
+              <w:rPr>
+                <w:rFonts w:eastAsia="Google Sans" w:cs="Times New Roman"/>
+                <w:sz w:val="18"/>
+                <w:szCs w:val="18"/>
+              </w:rPr>
+            </w:pPr>
+            <w:r>
+              <w:rPr>
+                <w:rFonts w:eastAsia="Google Sans" w:cs="Times New Roman"/>
+                <w:sz w:val="18"/>
+                <w:szCs w:val="18"/>
+              </w:rPr>
+              <w:t>Khóa ngoại trỏ đến bảng users</w:t>
+            </w:r>
+            <w:r>
+              <w:rPr>
+                <w:rFonts w:eastAsia="Google Sans" w:cs="Times New Roman"/>
+                <w:sz w:val="18"/>
+                <w:szCs w:val="18"/>
+              </w:rPr>
+              <w:t>.</w:t>
+            </w:r>
+          </w:p>
+        </w:tc>
+      </w:tr>
+      <w:tr>
+        <w:tc>
+          <w:tcPr>
+            <w:tcW w:w="864" w:type="dxa"/>
+          </w:tcPr>
+          <w:p>
+            <w:pPr>
+              <w:pBdr>
+                <w:top w:val="nil"/>
+                <w:left w:val="nil"/>
+                <w:bottom w:val="nil"/>
+                <w:right w:val="nil"/>
+                <w:between w:val="nil"/>
+              </w:pBdr>
+              <w:spacing w:line="275" w:lineRule="auto"/>
+              <w:rPr>
+                <w:rFonts w:eastAsia="Google Sans" w:cs="Times New Roman"/>
+                <w:sz w:val="18"/>
+                <w:szCs w:val="18"/>
+              </w:rPr>
+            </w:pPr>
+            <w:r>
+              <w:rPr>
+                <w:rFonts w:eastAsia="Google Sans" w:cs="Times New Roman"/>
+                <w:sz w:val="18"/>
+                <w:szCs w:val="18"/>
+              </w:rPr>
+              <w:t>3</w:t>
+            </w:r>
+          </w:p>
+        </w:tc>
+        <w:tc>
+          <w:tcPr>
+            <w:tcW w:w="1152" w:type="dxa"/>
+          </w:tcPr>
+          <w:p>
+            <w:pPr>
+              <w:pBdr>
+                <w:top w:val="nil"/>
+                <w:left w:val="nil"/>
+                <w:bottom w:val="nil"/>
+                <w:right w:val="nil"/>
+                <w:between w:val="nil"/>
+              </w:pBdr>
+              <w:spacing w:line="275" w:lineRule="auto"/>
+              <w:rPr>
+                <w:rFonts w:eastAsia="Google Sans" w:cs="Times New Roman"/>
+                <w:sz w:val="18"/>
+                <w:szCs w:val="18"/>
+              </w:rPr>
+            </w:pPr>
+            <w:r>
+              <w:rPr>
+                <w:rFonts w:eastAsia="Google Sans" w:cs="Times New Roman"/>
+                <w:sz w:val="18"/>
+                <w:szCs w:val="18"/>
+              </w:rPr>
+              <w:t>campaign_id</w:t>
+            </w:r>
+          </w:p>
+        </w:tc>
+        <w:tc>
+          <w:tcPr>
+            <w:tcW w:w="1152" w:type="dxa"/>
+          </w:tcPr>
+          <w:p>
+            <w:pPr>
+              <w:pBdr>
+                <w:top w:val="nil"/>
+                <w:left w:val="nil"/>
+                <w:bottom w:val="nil"/>
+                <w:right w:val="nil"/>
+                <w:between w:val="nil"/>
+              </w:pBdr>
+              <w:spacing w:line="275" w:lineRule="auto"/>
+              <w:rPr>
+                <w:rFonts w:eastAsia="Google Sans" w:cs="Times New Roman"/>
+                <w:sz w:val="18"/>
+                <w:szCs w:val="18"/>
+              </w:rPr>
+            </w:pPr>
+            <w:r>
+              <w:rPr>
+                <w:rFonts w:eastAsia="Google Sans" w:cs="Times New Roman"/>
+                <w:sz w:val="18"/>
+                <w:szCs w:val="18"/>
+              </w:rPr>
+              <w:t>int</w:t>
+            </w:r>
+          </w:p>
+        </w:tc>
+        <w:tc>
+          <w:tcPr>
+            <w:tcW w:w="864" w:type="dxa"/>
+          </w:tcPr>
+          <w:p>
+            <w:pPr>
+              <w:pBdr>
+                <w:top w:val="nil"/>
+                <w:left w:val="nil"/>
+                <w:bottom w:val="nil"/>
+                <w:right w:val="nil"/>
+                <w:between w:val="nil"/>
+              </w:pBdr>
+              <w:spacing w:line="275" w:lineRule="auto"/>
+              <w:rPr>
+                <w:rFonts w:eastAsia="Google Sans" w:cs="Times New Roman"/>
+                <w:sz w:val="18"/>
+                <w:szCs w:val="18"/>
+              </w:rPr>
+            </w:pPr>
+            <w:r>
+              <w:rPr>
+                <w:rFonts w:eastAsia="Google Sans" w:cs="Times New Roman"/>
+                <w:sz w:val="18"/>
+                <w:szCs w:val="18"/>
+              </w:rPr>
+              <w:t>11</w:t>
+            </w:r>
+          </w:p>
+        </w:tc>
+        <w:tc>
+          <w:tcPr>
+            <w:tcW w:w="864" w:type="dxa"/>
+          </w:tcPr>
+          <w:p>
+            <w:pPr>
+              <w:pBdr>
+                <w:top w:val="nil"/>
+                <w:left w:val="nil"/>
+                <w:bottom w:val="nil"/>
+                <w:right w:val="nil"/>
+                <w:between w:val="nil"/>
+              </w:pBdr>
+              <w:spacing w:line="275" w:lineRule="auto"/>
+              <w:rPr>
+                <w:rFonts w:eastAsia="Google Sans" w:cs="Times New Roman"/>
+                <w:sz w:val="18"/>
+                <w:szCs w:val="18"/>
+              </w:rPr>
+            </w:pPr>
+          </w:p>
+        </w:tc>
+        <w:tc>
+          <w:tcPr>
+            <w:tcW w:w="864" w:type="dxa"/>
+          </w:tcPr>
+          <w:p>
+            <w:pPr>
+              <w:pBdr>
+                <w:top w:val="nil"/>
+                <w:left w:val="nil"/>
+                <w:bottom w:val="nil"/>
+                <w:right w:val="nil"/>
+                <w:between w:val="nil"/>
+              </w:pBdr>
+              <w:spacing w:line="275" w:lineRule="auto"/>
+              <w:rPr>
+                <w:rFonts w:eastAsia="Google Sans" w:cs="Times New Roman"/>
+                <w:sz w:val="18"/>
+                <w:szCs w:val="18"/>
+              </w:rPr>
+            </w:pPr>
+            <w:r>
+              <w:rPr>
+                <w:rFonts w:eastAsia="Google Sans" w:cs="Times New Roman"/>
+                <w:sz w:val="18"/>
+                <w:szCs w:val="18"/>
+              </w:rPr>
+              <w:t>x</w:t>
+            </w:r>
+          </w:p>
+        </w:tc>
+        <w:tc>
+          <w:tcPr>
+            <w:tcW w:w="864" w:type="dxa"/>
+          </w:tcPr>
+          <w:p>
+            <w:pPr>
+              <w:pBdr>
+                <w:top w:val="nil"/>
+                <w:left w:val="nil"/>
+                <w:bottom w:val="nil"/>
+                <w:right w:val="nil"/>
+                <w:between w:val="nil"/>
+              </w:pBdr>
+              <w:spacing w:line="275" w:lineRule="auto"/>
+              <w:rPr>
+                <w:rFonts w:eastAsia="Google Sans" w:cs="Times New Roman"/>
+                <w:sz w:val="18"/>
+                <w:szCs w:val="18"/>
+              </w:rPr>
+            </w:pPr>
+          </w:p>
+        </w:tc>
+        <w:tc>
+          <w:tcPr>
+            <w:tcW w:w="864" w:type="dxa"/>
+          </w:tcPr>
+          <w:p>
+            <w:pPr>
+              <w:pBdr>
+                <w:top w:val="nil"/>
+                <w:left w:val="nil"/>
+                <w:bottom w:val="nil"/>
+                <w:right w:val="nil"/>
+                <w:between w:val="nil"/>
+              </w:pBdr>
+              <w:spacing w:line="275" w:lineRule="auto"/>
+              <w:rPr>
+                <w:rFonts w:eastAsia="Google Sans" w:cs="Times New Roman"/>
+                <w:sz w:val="18"/>
+                <w:szCs w:val="18"/>
+              </w:rPr>
+            </w:pPr>
+            <w:r>
+              <w:rPr>
+                <w:rFonts w:eastAsia="Google Sans" w:cs="Times New Roman"/>
+                <w:sz w:val="18"/>
+                <w:szCs w:val="18"/>
+              </w:rPr>
+              <w:t>F</w:t>
+            </w:r>
+          </w:p>
+        </w:tc>
+        <w:tc>
+          <w:tcPr>
+            <w:tcW w:w="864" w:type="dxa"/>
+          </w:tcPr>
+          <w:p>
+            <w:pPr>
+              <w:pBdr>
+                <w:top w:val="nil"/>
+                <w:left w:val="nil"/>
+                <w:bottom w:val="nil"/>
+                <w:right w:val="nil"/>
+                <w:between w:val="nil"/>
+              </w:pBdr>
+              <w:spacing w:line="275" w:lineRule="auto"/>
+              <w:rPr>
+                <w:rFonts w:eastAsia="Google Sans" w:cs="Times New Roman"/>
+                <w:sz w:val="18"/>
+                <w:szCs w:val="18"/>
+              </w:rPr>
+            </w:pPr>
+          </w:p>
+        </w:tc>
+        <w:tc>
+          <w:tcPr>
+            <w:tcW w:w="2016" w:type="dxa"/>
+          </w:tcPr>
+          <w:p>
+            <w:pPr>
+              <w:pBdr>
+                <w:top w:val="nil"/>
+                <w:left w:val="nil"/>
+                <w:bottom w:val="nil"/>
+                <w:right w:val="nil"/>
+                <w:between w:val="nil"/>
+              </w:pBdr>
+              <w:spacing w:line="275" w:lineRule="auto"/>
+              <w:rPr>
+                <w:rFonts w:eastAsia="Google Sans" w:cs="Times New Roman"/>
+                <w:sz w:val="18"/>
+                <w:szCs w:val="18"/>
+              </w:rPr>
+            </w:pPr>
+            <w:r>
+              <w:rPr>
+                <w:rFonts w:eastAsia="Google Sans" w:cs="Times New Roman"/>
+                <w:sz w:val="18"/>
+                <w:szCs w:val="18"/>
+              </w:rPr>
+              <w:t>Khóa ngoại trỏ đến bảng campaigns</w:t>
+            </w:r>
+            <w:r>
+              <w:rPr>
+                <w:rFonts w:eastAsia="Google Sans" w:cs="Times New Roman"/>
+                <w:sz w:val="18"/>
+                <w:szCs w:val="18"/>
+              </w:rPr>
+              <w:t>.</w:t>
+            </w:r>
+          </w:p>
+        </w:tc>
+      </w:tr>
+      <w:tr>
+        <w:tc>
+          <w:tcPr>
+            <w:tcW w:w="864" w:type="dxa"/>
+          </w:tcPr>
+          <w:p>
+            <w:pPr>
+              <w:pBdr>
+                <w:top w:val="nil"/>
+                <w:left w:val="nil"/>
+                <w:bottom w:val="nil"/>
+                <w:right w:val="nil"/>
+                <w:between w:val="nil"/>
+              </w:pBdr>
+              <w:spacing w:line="275" w:lineRule="auto"/>
+              <w:rPr>
+                <w:rFonts w:eastAsia="Google Sans" w:cs="Times New Roman"/>
+                <w:sz w:val="18"/>
+                <w:szCs w:val="18"/>
+              </w:rPr>
+            </w:pPr>
+            <w:r>
+              <w:rPr>
+                <w:rFonts w:eastAsia="Google Sans" w:cs="Times New Roman"/>
+                <w:sz w:val="18"/>
+                <w:szCs w:val="18"/>
+              </w:rPr>
+              <w:t>4</w:t>
+            </w:r>
+          </w:p>
+        </w:tc>
+        <w:tc>
+          <w:tcPr>
+            <w:tcW w:w="1152" w:type="dxa"/>
+          </w:tcPr>
+          <w:p>
+            <w:pPr>
+              <w:pBdr>
+                <w:top w:val="nil"/>
+                <w:left w:val="nil"/>
+                <w:bottom w:val="nil"/>
+                <w:right w:val="nil"/>
+                <w:between w:val="nil"/>
+              </w:pBdr>
+              <w:spacing w:line="275" w:lineRule="auto"/>
+              <w:rPr>
+                <w:rFonts w:eastAsia="Google Sans" w:cs="Times New Roman"/>
+                <w:sz w:val="18"/>
+                <w:szCs w:val="18"/>
+              </w:rPr>
+            </w:pPr>
+            <w:r>
+              <w:rPr>
+                <w:rFonts w:eastAsia="Google Sans" w:cs="Times New Roman"/>
+                <w:sz w:val="18"/>
+                <w:szCs w:val="18"/>
+              </w:rPr>
+              <w:t>receive_email</w:t>
+            </w:r>
+          </w:p>
+        </w:tc>
+        <w:tc>
+          <w:tcPr>
+            <w:tcW w:w="1152" w:type="dxa"/>
+          </w:tcPr>
+          <w:p>
+            <w:pPr>
+              <w:pBdr>
+                <w:top w:val="nil"/>
+                <w:left w:val="nil"/>
+                <w:bottom w:val="nil"/>
+                <w:right w:val="nil"/>
+                <w:between w:val="nil"/>
+              </w:pBdr>
+              <w:spacing w:line="275" w:lineRule="auto"/>
+              <w:rPr>
+                <w:rFonts w:eastAsia="Google Sans" w:cs="Times New Roman"/>
+                <w:sz w:val="18"/>
+                <w:szCs w:val="18"/>
+              </w:rPr>
+            </w:pPr>
+            <w:r>
+              <w:rPr>
+                <w:rFonts w:eastAsia="Google Sans" w:cs="Times New Roman"/>
+                <w:sz w:val="18"/>
+                <w:szCs w:val="18"/>
+              </w:rPr>
+              <w:t>tiny</w:t>
+            </w:r>
+            <w:r>
+              <w:rPr>
+                <w:rFonts w:eastAsia="Google Sans" w:cs="Times New Roman"/>
+                <w:sz w:val="18"/>
+                <w:szCs w:val="18"/>
+              </w:rPr>
+              <w:t>int</w:t>
+            </w:r>
+          </w:p>
+        </w:tc>
+        <w:tc>
+          <w:tcPr>
+            <w:tcW w:w="864" w:type="dxa"/>
+          </w:tcPr>
+          <w:p>
+            <w:pPr>
+              <w:pBdr>
+                <w:top w:val="nil"/>
+                <w:left w:val="nil"/>
+                <w:bottom w:val="nil"/>
+                <w:right w:val="nil"/>
+                <w:between w:val="nil"/>
+              </w:pBdr>
+              <w:spacing w:line="275" w:lineRule="auto"/>
+              <w:rPr>
+                <w:rFonts w:eastAsia="Google Sans" w:cs="Times New Roman"/>
+                <w:sz w:val="18"/>
+                <w:szCs w:val="18"/>
+              </w:rPr>
+            </w:pPr>
+            <w:r>
+              <w:rPr>
+                <w:rFonts w:eastAsia="Google Sans" w:cs="Times New Roman"/>
+                <w:sz w:val="18"/>
+                <w:szCs w:val="18"/>
+              </w:rPr>
+              <w:t>1</w:t>
+            </w:r>
+          </w:p>
+        </w:tc>
+        <w:tc>
+          <w:tcPr>
+            <w:tcW w:w="864" w:type="dxa"/>
+          </w:tcPr>
+          <w:p>
+            <w:pPr>
+              <w:pBdr>
+                <w:top w:val="nil"/>
+                <w:left w:val="nil"/>
+                <w:bottom w:val="nil"/>
+                <w:right w:val="nil"/>
+                <w:between w:val="nil"/>
+              </w:pBdr>
+              <w:spacing w:line="275" w:lineRule="auto"/>
+              <w:rPr>
+                <w:rFonts w:eastAsia="Google Sans" w:cs="Times New Roman"/>
+                <w:sz w:val="18"/>
+                <w:szCs w:val="18"/>
+              </w:rPr>
+            </w:pPr>
+          </w:p>
+        </w:tc>
+        <w:tc>
+          <w:tcPr>
+            <w:tcW w:w="864" w:type="dxa"/>
+          </w:tcPr>
+          <w:p>
+            <w:pPr>
+              <w:pBdr>
+                <w:top w:val="nil"/>
+                <w:left w:val="nil"/>
+                <w:bottom w:val="nil"/>
+                <w:right w:val="nil"/>
+                <w:between w:val="nil"/>
+              </w:pBdr>
+              <w:spacing w:line="275" w:lineRule="auto"/>
+              <w:rPr>
+                <w:rFonts w:eastAsia="Google Sans" w:cs="Times New Roman"/>
+                <w:sz w:val="18"/>
+                <w:szCs w:val="18"/>
+              </w:rPr>
+            </w:pPr>
+          </w:p>
+        </w:tc>
+        <w:tc>
+          <w:tcPr>
+            <w:tcW w:w="864" w:type="dxa"/>
+          </w:tcPr>
+          <w:p>
+            <w:pPr>
+              <w:pBdr>
+                <w:top w:val="nil"/>
+                <w:left w:val="nil"/>
+                <w:bottom w:val="nil"/>
+                <w:right w:val="nil"/>
+                <w:between w:val="nil"/>
+              </w:pBdr>
+              <w:spacing w:line="275" w:lineRule="auto"/>
+              <w:rPr>
+                <w:rFonts w:eastAsia="Google Sans" w:cs="Times New Roman"/>
+                <w:sz w:val="18"/>
+                <w:szCs w:val="18"/>
+              </w:rPr>
+            </w:pPr>
+          </w:p>
+        </w:tc>
+        <w:tc>
+          <w:tcPr>
+            <w:tcW w:w="864" w:type="dxa"/>
+          </w:tcPr>
+          <w:p>
+            <w:pPr>
+              <w:pBdr>
+                <w:top w:val="nil"/>
+                <w:left w:val="nil"/>
+                <w:bottom w:val="nil"/>
+                <w:right w:val="nil"/>
+                <w:between w:val="nil"/>
+              </w:pBdr>
+              <w:spacing w:line="275" w:lineRule="auto"/>
+              <w:rPr>
+                <w:rFonts w:eastAsia="Google Sans" w:cs="Times New Roman"/>
+                <w:sz w:val="18"/>
+                <w:szCs w:val="18"/>
+              </w:rPr>
+            </w:pPr>
+          </w:p>
+        </w:tc>
+        <w:tc>
+          <w:tcPr>
+            <w:tcW w:w="864" w:type="dxa"/>
+          </w:tcPr>
+          <w:p>
+            <w:pPr>
+              <w:pBdr>
+                <w:top w:val="nil"/>
+                <w:left w:val="nil"/>
+                <w:bottom w:val="nil"/>
+                <w:right w:val="nil"/>
+                <w:between w:val="nil"/>
+              </w:pBdr>
+              <w:spacing w:line="275" w:lineRule="auto"/>
+              <w:rPr>
+                <w:rFonts w:eastAsia="Google Sans" w:cs="Times New Roman"/>
+                <w:sz w:val="18"/>
+                <w:szCs w:val="18"/>
+              </w:rPr>
+            </w:pPr>
+            <w:r>
+              <w:rPr>
+                <w:rFonts w:eastAsia="Google Sans" w:cs="Times New Roman"/>
+                <w:sz w:val="18"/>
+                <w:szCs w:val="18"/>
+              </w:rPr>
+              <w:t>0</w:t>
+            </w:r>
+          </w:p>
+        </w:tc>
+        <w:tc>
+          <w:tcPr>
+            <w:tcW w:w="2016" w:type="dxa"/>
+          </w:tcPr>
+          <w:p>
+            <w:pPr>
+              <w:pBdr>
+                <w:top w:val="nil"/>
+                <w:left w:val="nil"/>
+                <w:bottom w:val="nil"/>
+                <w:right w:val="nil"/>
+                <w:between w:val="nil"/>
+              </w:pBdr>
+              <w:spacing w:line="275" w:lineRule="auto"/>
+              <w:rPr>
+                <w:rFonts w:eastAsia="Google Sans" w:cs="Times New Roman"/>
+                <w:sz w:val="18"/>
+                <w:szCs w:val="18"/>
+              </w:rPr>
+            </w:pPr>
+            <w:r>
+              <w:rPr>
+                <w:rFonts w:eastAsia="Google Sans" w:cs="Times New Roman"/>
+                <w:sz w:val="18"/>
+                <w:szCs w:val="18"/>
+              </w:rPr>
+              <w:t>Cấu hình thông báo: 0=Tắt, 1=bật nhận email khi có cập nhật mới</w:t>
+            </w:r>
+            <w:r>
+              <w:rPr>
+                <w:rFonts w:eastAsia="Google Sans" w:cs="Times New Roman"/>
+                <w:sz w:val="18"/>
+                <w:szCs w:val="18"/>
+              </w:rPr>
+              <w:t>.</w:t>
+            </w:r>
+          </w:p>
+        </w:tc>
+      </w:tr>
+      <w:tr>
+        <w:tc>
+          <w:tcPr>
+            <w:tcW w:w="864" w:type="dxa"/>
+          </w:tcPr>
+          <w:p>
+            <w:pPr>
+              <w:pBdr>
+                <w:top w:val="nil"/>
+                <w:left w:val="nil"/>
+                <w:bottom w:val="nil"/>
+                <w:right w:val="nil"/>
+                <w:between w:val="nil"/>
+              </w:pBdr>
+              <w:spacing w:line="275" w:lineRule="auto"/>
+              <w:rPr>
+                <w:rFonts w:eastAsia="Google Sans" w:cs="Times New Roman"/>
+                <w:sz w:val="18"/>
+                <w:szCs w:val="18"/>
+              </w:rPr>
+            </w:pPr>
+            <w:r>
+              <w:rPr>
+                <w:rFonts w:eastAsia="Google Sans" w:cs="Times New Roman"/>
+                <w:sz w:val="18"/>
+                <w:szCs w:val="18"/>
+              </w:rPr>
+              <w:t>5</w:t>
+            </w:r>
+          </w:p>
+        </w:tc>
+        <w:tc>
+          <w:tcPr>
+            <w:tcW w:w="1152" w:type="dxa"/>
+          </w:tcPr>
+          <w:p>
+            <w:pPr>
+              <w:pBdr>
+                <w:top w:val="nil"/>
+                <w:left w:val="nil"/>
+                <w:bottom w:val="nil"/>
+                <w:right w:val="nil"/>
+                <w:between w:val="nil"/>
+              </w:pBdr>
+              <w:spacing w:line="275" w:lineRule="auto"/>
+              <w:rPr>
+                <w:rFonts w:eastAsia="Google Sans" w:cs="Times New Roman"/>
+                <w:sz w:val="18"/>
+                <w:szCs w:val="18"/>
+              </w:rPr>
+            </w:pPr>
+            <w:r>
+              <w:rPr>
+                <w:rFonts w:eastAsia="Google Sans" w:cs="Times New Roman"/>
+                <w:sz w:val="18"/>
+                <w:szCs w:val="18"/>
+              </w:rPr>
+              <w:t>created_at</w:t>
+            </w:r>
+          </w:p>
+        </w:tc>
+        <w:tc>
+          <w:tcPr>
+            <w:tcW w:w="1152" w:type="dxa"/>
+          </w:tcPr>
+          <w:p>
+            <w:pPr>
+              <w:pBdr>
+                <w:top w:val="nil"/>
+                <w:left w:val="nil"/>
+                <w:bottom w:val="nil"/>
+                <w:right w:val="nil"/>
+                <w:between w:val="nil"/>
+              </w:pBdr>
+              <w:spacing w:line="275" w:lineRule="auto"/>
+              <w:rPr>
+                <w:rFonts w:eastAsia="Google Sans" w:cs="Times New Roman"/>
+                <w:sz w:val="18"/>
+                <w:szCs w:val="18"/>
+              </w:rPr>
+            </w:pPr>
+            <w:r>
+              <w:rPr>
+                <w:rFonts w:eastAsia="Google Sans" w:cs="Times New Roman"/>
+                <w:sz w:val="18"/>
+                <w:szCs w:val="18"/>
+              </w:rPr>
+              <w:t>timestamp</w:t>
+            </w:r>
+          </w:p>
+        </w:tc>
+        <w:tc>
+          <w:tcPr>
+            <w:tcW w:w="864" w:type="dxa"/>
+          </w:tcPr>
+          <w:p>
+            <w:pPr>
+              <w:pBdr>
+                <w:top w:val="nil"/>
+                <w:left w:val="nil"/>
+                <w:bottom w:val="nil"/>
+                <w:right w:val="nil"/>
+                <w:between w:val="nil"/>
+              </w:pBdr>
+              <w:spacing w:line="275" w:lineRule="auto"/>
+              <w:rPr>
+                <w:rFonts w:eastAsia="Google Sans" w:cs="Times New Roman"/>
+                <w:sz w:val="18"/>
+                <w:szCs w:val="18"/>
+              </w:rPr>
+            </w:pPr>
+          </w:p>
+        </w:tc>
+        <w:tc>
+          <w:tcPr>
+            <w:tcW w:w="864" w:type="dxa"/>
+          </w:tcPr>
+          <w:p>
+            <w:pPr>
+              <w:pBdr>
+                <w:top w:val="nil"/>
+                <w:left w:val="nil"/>
+                <w:bottom w:val="nil"/>
+                <w:right w:val="nil"/>
+                <w:between w:val="nil"/>
+              </w:pBdr>
+              <w:spacing w:line="275" w:lineRule="auto"/>
+              <w:rPr>
+                <w:rFonts w:eastAsia="Google Sans" w:cs="Times New Roman"/>
+                <w:sz w:val="18"/>
+                <w:szCs w:val="18"/>
+              </w:rPr>
+            </w:pPr>
+          </w:p>
+        </w:tc>
+        <w:tc>
+          <w:tcPr>
+            <w:tcW w:w="864" w:type="dxa"/>
+          </w:tcPr>
+          <w:p>
+            <w:pPr>
+              <w:pBdr>
+                <w:top w:val="nil"/>
+                <w:left w:val="nil"/>
+                <w:bottom w:val="nil"/>
+                <w:right w:val="nil"/>
+                <w:between w:val="nil"/>
+              </w:pBdr>
+              <w:spacing w:line="275" w:lineRule="auto"/>
+              <w:rPr>
+                <w:rFonts w:eastAsia="Google Sans" w:cs="Times New Roman"/>
+                <w:sz w:val="18"/>
+                <w:szCs w:val="18"/>
+              </w:rPr>
+            </w:pPr>
+          </w:p>
+        </w:tc>
+        <w:tc>
+          <w:tcPr>
+            <w:tcW w:w="864" w:type="dxa"/>
+          </w:tcPr>
+          <w:p>
+            <w:pPr>
+              <w:pBdr>
+                <w:top w:val="nil"/>
+                <w:left w:val="nil"/>
+                <w:bottom w:val="nil"/>
+                <w:right w:val="nil"/>
+                <w:between w:val="nil"/>
+              </w:pBdr>
+              <w:spacing w:line="275" w:lineRule="auto"/>
+              <w:rPr>
+                <w:rFonts w:eastAsia="Google Sans" w:cs="Times New Roman"/>
+                <w:sz w:val="18"/>
+                <w:szCs w:val="18"/>
+              </w:rPr>
+            </w:pPr>
+          </w:p>
+        </w:tc>
+        <w:tc>
+          <w:tcPr>
+            <w:tcW w:w="864" w:type="dxa"/>
+          </w:tcPr>
+          <w:p>
+            <w:pPr>
+              <w:pBdr>
+                <w:top w:val="nil"/>
+                <w:left w:val="nil"/>
+                <w:bottom w:val="nil"/>
+                <w:right w:val="nil"/>
+                <w:between w:val="nil"/>
+              </w:pBdr>
+              <w:spacing w:line="275" w:lineRule="auto"/>
+              <w:rPr>
+                <w:rFonts w:eastAsia="Google Sans" w:cs="Times New Roman"/>
+                <w:sz w:val="18"/>
+                <w:szCs w:val="18"/>
+              </w:rPr>
+            </w:pPr>
+          </w:p>
+        </w:tc>
+        <w:tc>
+          <w:tcPr>
+            <w:tcW w:w="864" w:type="dxa"/>
+          </w:tcPr>
+          <w:p>
+            <w:pPr>
+              <w:pBdr>
+                <w:top w:val="nil"/>
+                <w:left w:val="nil"/>
+                <w:bottom w:val="nil"/>
+                <w:right w:val="nil"/>
+                <w:between w:val="nil"/>
+              </w:pBdr>
+              <w:spacing w:line="275" w:lineRule="auto"/>
+              <w:rPr>
+                <w:rFonts w:eastAsia="Google Sans" w:cs="Times New Roman"/>
+                <w:sz w:val="18"/>
+                <w:szCs w:val="18"/>
+              </w:rPr>
+            </w:pPr>
+            <w:r>
+              <w:rPr>
+                <w:rFonts w:eastAsia="Google Sans" w:cs="Times New Roman"/>
+                <w:sz w:val="18"/>
+                <w:szCs w:val="18"/>
+              </w:rPr>
+              <w:t>CURRENT</w:t>
+            </w:r>
+          </w:p>
+        </w:tc>
+        <w:tc>
+          <w:tcPr>
+            <w:tcW w:w="2016" w:type="dxa"/>
+          </w:tcPr>
+          <w:p>
+            <w:pPr>
+              <w:pBdr>
+                <w:top w:val="nil"/>
+                <w:left w:val="nil"/>
+                <w:bottom w:val="nil"/>
+                <w:right w:val="nil"/>
+                <w:between w:val="nil"/>
+              </w:pBdr>
+              <w:spacing w:line="275" w:lineRule="auto"/>
+              <w:rPr>
+                <w:rFonts w:eastAsia="Google Sans" w:cs="Times New Roman"/>
+                <w:sz w:val="18"/>
+                <w:szCs w:val="18"/>
+              </w:rPr>
+            </w:pPr>
+            <w:r>
+              <w:rPr>
+                <w:rFonts w:eastAsia="Google Sans" w:cs="Times New Roman"/>
+                <w:sz w:val="18"/>
+                <w:szCs w:val="18"/>
+              </w:rPr>
+              <w:t>Thời điểm người dùng nhấn nút “Theo dõi” chiến dịch</w:t>
             </w:r>
           </w:p>
         </w:tc>
@@ -16392,7 +18794,6 @@
         <w:rPr>
           <w:rFonts w:eastAsia="Google Sans" w:cs="Times New Roman"/>
         </w:rPr>
-        <w:lastRenderedPageBreak/>
         <w:t>2. THIẾT KẾ MÃ CODE CÁC TRƯỜNG</w:t>
       </w:r>
     </w:p>
@@ -16885,7 +19286,14 @@
         <w:rPr>
           <w:rFonts w:eastAsia="Google Sans" w:cs="Times New Roman"/>
         </w:rPr>
-        <w:t xml:space="preserve"> Để tuân thủ chuẩn hóa cơ sở dữ liệu 3NF, đối với các Khách vãng lai (Guest) thực hiện quyên góp mà không đăng nhập, hệ thống sẽ tự động tạo một tài khoản ngầm trong bảng users với role_id = 1 (GUEST) và password = NULL. Nhờ vậy, bảng donations không cần phải lưu trữ thừa các cột như tên hay email của người quyên góp.</w:t>
+        <w:t xml:space="preserve"> Để tuân thủ chuẩn hóa cơ sở dữ liệu 3NF, đối với các Khách vãng lai (Guest) thực hiện quyên góp mà không đăng nhập, hệ thống sẽ tự động tạo một tài khoản </w:t>
+      </w:r>
+      <w:r>
+        <w:rPr>
+          <w:rFonts w:eastAsia="Google Sans" w:cs="Times New Roman"/>
+        </w:rPr>
+        <w:lastRenderedPageBreak/>
+        <w:t>ngầm trong bảng users với role_id = 1 (GUEST) và password = NULL. Nhờ vậy, bảng donations không cần phải lưu trữ thừa các cột như tên hay email của người quyên góp.</w:t>
       </w:r>
     </w:p>
     <w:p>

</xml_diff>